<commit_message>
Replace CSL URLs with local copies and regenerate artifacts
- Added local CSL files: chicago-note-bibliography.csl and chicago-author-date.csl
- Updated article/article.md, thesis/00.md, presentation/presentation.md, and README.md to use local CSL paths
- Fixed pandoc-crossref download URL in pandoc.yml workflow
- Regenerated all build artifacts (docx, pdf, tex, epub, pptx, html)

Co-authored-by: maehr <14755525+maehr@users.noreply.github.com>
</commit_message>
<xml_diff>
--- a/article/article.docx
+++ b/article/article.docx
@@ -22,82 +22,34 @@
       <w:pPr>
         <w:pStyle w:val="Author"/>
       </w:pPr>
-      <w:hyperlink r:id="rId20">
+      <w:hyperlink r:id="rId9">
         <w:r>
           <w:rPr>
             <w:rStyle w:val="Hyperlink"/>
           </w:rPr>
-          <w:t xml:space="preserve">Eleanor</w:t>
+          <w:t xml:space="preserve">Eleanor Roosevelt</w:t>
         </w:r>
+      </w:hyperlink>
+    </w:p>
+    <w:p>
+      <w:pPr>
+        <w:pStyle w:val="Author"/>
+      </w:pPr>
+      <w:hyperlink r:id="rId10">
         <w:r>
           <w:rPr>
             <w:rStyle w:val="Hyperlink"/>
           </w:rPr>
-          <w:t xml:space="preserve"> </w:t>
-        </w:r>
-        <w:r>
-          <w:rPr>
-            <w:rStyle w:val="Hyperlink"/>
-          </w:rPr>
-          <w:t xml:space="preserve">Roosevelt</w:t>
+          <w:t xml:space="preserve">John Peters Humphrey</w:t>
         </w:r>
       </w:hyperlink>
     </w:p>
     <w:p>
       <w:pPr>
-        <w:pStyle w:val="Author"/>
-      </w:pPr>
-      <w:hyperlink r:id="rId21">
-        <w:r>
-          <w:rPr>
-            <w:rStyle w:val="Hyperlink"/>
-          </w:rPr>
-          <w:t xml:space="preserve">John</w:t>
-        </w:r>
-        <w:r>
-          <w:rPr>
-            <w:rStyle w:val="Hyperlink"/>
-          </w:rPr>
-          <w:t xml:space="preserve"> </w:t>
-        </w:r>
-        <w:r>
-          <w:rPr>
-            <w:rStyle w:val="Hyperlink"/>
-          </w:rPr>
-          <w:t xml:space="preserve">Peters</w:t>
-        </w:r>
-        <w:r>
-          <w:rPr>
-            <w:rStyle w:val="Hyperlink"/>
-          </w:rPr>
-          <w:t xml:space="preserve"> </w:t>
-        </w:r>
-        <w:r>
-          <w:rPr>
-            <w:rStyle w:val="Hyperlink"/>
-          </w:rPr>
-          <w:t xml:space="preserve">Humphrey</w:t>
-        </w:r>
-      </w:hyperlink>
-    </w:p>
-    <w:p>
-      <w:pPr>
         <w:pStyle w:val="Date"/>
       </w:pPr>
       <w:r>
-        <w:t xml:space="preserve">1</w:t>
-      </w:r>
-      <w:r>
-        <w:t xml:space="preserve"> </w:t>
-      </w:r>
-      <w:r>
-        <w:t xml:space="preserve">January</w:t>
-      </w:r>
-      <w:r>
-        <w:t xml:space="preserve"> </w:t>
-      </w:r>
-      <w:r>
-        <w:t xml:space="preserve">2023</w:t>
+        <w:t xml:space="preserve">1 January 2023</w:t>
       </w:r>
     </w:p>
     <w:p>
@@ -113,289 +65,7 @@
         <w:pStyle w:val="Abstract"/>
       </w:pPr>
       <w:r>
-        <w:t xml:space="preserve">All</w:t>
-      </w:r>
-      <w:r>
-        <w:t xml:space="preserve"> </w:t>
-      </w:r>
-      <w:r>
-        <w:t xml:space="preserve">human</w:t>
-      </w:r>
-      <w:r>
-        <w:t xml:space="preserve"> </w:t>
-      </w:r>
-      <w:r>
-        <w:t xml:space="preserve">beings</w:t>
-      </w:r>
-      <w:r>
-        <w:t xml:space="preserve"> </w:t>
-      </w:r>
-      <w:r>
-        <w:t xml:space="preserve">are</w:t>
-      </w:r>
-      <w:r>
-        <w:t xml:space="preserve"> </w:t>
-      </w:r>
-      <w:r>
-        <w:t xml:space="preserve">born</w:t>
-      </w:r>
-      <w:r>
-        <w:t xml:space="preserve"> </w:t>
-      </w:r>
-      <w:r>
-        <w:t xml:space="preserve">free</w:t>
-      </w:r>
-      <w:r>
-        <w:t xml:space="preserve"> </w:t>
-      </w:r>
-      <w:r>
-        <w:t xml:space="preserve">and</w:t>
-      </w:r>
-      <w:r>
-        <w:t xml:space="preserve"> </w:t>
-      </w:r>
-      <w:r>
-        <w:t xml:space="preserve">equal</w:t>
-      </w:r>
-      <w:r>
-        <w:t xml:space="preserve"> </w:t>
-      </w:r>
-      <w:r>
-        <w:t xml:space="preserve">in</w:t>
-      </w:r>
-      <w:r>
-        <w:t xml:space="preserve"> </w:t>
-      </w:r>
-      <w:r>
-        <w:t xml:space="preserve">dignity</w:t>
-      </w:r>
-      <w:r>
-        <w:t xml:space="preserve"> </w:t>
-      </w:r>
-      <w:r>
-        <w:t xml:space="preserve">and</w:t>
-      </w:r>
-      <w:r>
-        <w:t xml:space="preserve"> </w:t>
-      </w:r>
-      <w:r>
-        <w:t xml:space="preserve">rights.</w:t>
-      </w:r>
-      <w:r>
-        <w:t xml:space="preserve"> </w:t>
-      </w:r>
-      <w:r>
-        <w:t xml:space="preserve">All</w:t>
-      </w:r>
-      <w:r>
-        <w:t xml:space="preserve"> </w:t>
-      </w:r>
-      <w:r>
-        <w:t xml:space="preserve">human</w:t>
-      </w:r>
-      <w:r>
-        <w:t xml:space="preserve"> </w:t>
-      </w:r>
-      <w:r>
-        <w:t xml:space="preserve">beings</w:t>
-      </w:r>
-      <w:r>
-        <w:t xml:space="preserve"> </w:t>
-      </w:r>
-      <w:r>
-        <w:t xml:space="preserve">are</w:t>
-      </w:r>
-      <w:r>
-        <w:t xml:space="preserve"> </w:t>
-      </w:r>
-      <w:r>
-        <w:t xml:space="preserve">born</w:t>
-      </w:r>
-      <w:r>
-        <w:t xml:space="preserve"> </w:t>
-      </w:r>
-      <w:r>
-        <w:t xml:space="preserve">free</w:t>
-      </w:r>
-      <w:r>
-        <w:t xml:space="preserve"> </w:t>
-      </w:r>
-      <w:r>
-        <w:t xml:space="preserve">and</w:t>
-      </w:r>
-      <w:r>
-        <w:t xml:space="preserve"> </w:t>
-      </w:r>
-      <w:r>
-        <w:t xml:space="preserve">equal</w:t>
-      </w:r>
-      <w:r>
-        <w:t xml:space="preserve"> </w:t>
-      </w:r>
-      <w:r>
-        <w:t xml:space="preserve">in</w:t>
-      </w:r>
-      <w:r>
-        <w:t xml:space="preserve"> </w:t>
-      </w:r>
-      <w:r>
-        <w:t xml:space="preserve">dignity</w:t>
-      </w:r>
-      <w:r>
-        <w:t xml:space="preserve"> </w:t>
-      </w:r>
-      <w:r>
-        <w:t xml:space="preserve">and</w:t>
-      </w:r>
-      <w:r>
-        <w:t xml:space="preserve"> </w:t>
-      </w:r>
-      <w:r>
-        <w:t xml:space="preserve">rights.</w:t>
-      </w:r>
-      <w:r>
-        <w:t xml:space="preserve"> </w:t>
-      </w:r>
-      <w:r>
-        <w:t xml:space="preserve">All</w:t>
-      </w:r>
-      <w:r>
-        <w:t xml:space="preserve"> </w:t>
-      </w:r>
-      <w:r>
-        <w:t xml:space="preserve">human</w:t>
-      </w:r>
-      <w:r>
-        <w:t xml:space="preserve"> </w:t>
-      </w:r>
-      <w:r>
-        <w:t xml:space="preserve">beings</w:t>
-      </w:r>
-      <w:r>
-        <w:t xml:space="preserve"> </w:t>
-      </w:r>
-      <w:r>
-        <w:t xml:space="preserve">are</w:t>
-      </w:r>
-      <w:r>
-        <w:t xml:space="preserve"> </w:t>
-      </w:r>
-      <w:r>
-        <w:t xml:space="preserve">born</w:t>
-      </w:r>
-      <w:r>
-        <w:t xml:space="preserve"> </w:t>
-      </w:r>
-      <w:r>
-        <w:t xml:space="preserve">free</w:t>
-      </w:r>
-      <w:r>
-        <w:t xml:space="preserve"> </w:t>
-      </w:r>
-      <w:r>
-        <w:t xml:space="preserve">and</w:t>
-      </w:r>
-      <w:r>
-        <w:t xml:space="preserve"> </w:t>
-      </w:r>
-      <w:r>
-        <w:t xml:space="preserve">equal</w:t>
-      </w:r>
-      <w:r>
-        <w:t xml:space="preserve"> </w:t>
-      </w:r>
-      <w:r>
-        <w:t xml:space="preserve">in</w:t>
-      </w:r>
-      <w:r>
-        <w:t xml:space="preserve"> </w:t>
-      </w:r>
-      <w:r>
-        <w:t xml:space="preserve">dignity</w:t>
-      </w:r>
-      <w:r>
-        <w:t xml:space="preserve"> </w:t>
-      </w:r>
-      <w:r>
-        <w:t xml:space="preserve">and</w:t>
-      </w:r>
-      <w:r>
-        <w:t xml:space="preserve"> </w:t>
-      </w:r>
-      <w:r>
-        <w:t xml:space="preserve">rights.</w:t>
-      </w:r>
-      <w:r>
-        <w:t xml:space="preserve"> </w:t>
-      </w:r>
-      <w:r>
-        <w:t xml:space="preserve">All</w:t>
-      </w:r>
-      <w:r>
-        <w:t xml:space="preserve"> </w:t>
-      </w:r>
-      <w:r>
-        <w:t xml:space="preserve">human</w:t>
-      </w:r>
-      <w:r>
-        <w:t xml:space="preserve"> </w:t>
-      </w:r>
-      <w:r>
-        <w:t xml:space="preserve">beings</w:t>
-      </w:r>
-      <w:r>
-        <w:t xml:space="preserve"> </w:t>
-      </w:r>
-      <w:r>
-        <w:t xml:space="preserve">are</w:t>
-      </w:r>
-      <w:r>
-        <w:t xml:space="preserve"> </w:t>
-      </w:r>
-      <w:r>
-        <w:t xml:space="preserve">born</w:t>
-      </w:r>
-      <w:r>
-        <w:t xml:space="preserve"> </w:t>
-      </w:r>
-      <w:r>
-        <w:t xml:space="preserve">free</w:t>
-      </w:r>
-      <w:r>
-        <w:t xml:space="preserve"> </w:t>
-      </w:r>
-      <w:r>
-        <w:t xml:space="preserve">and</w:t>
-      </w:r>
-      <w:r>
-        <w:t xml:space="preserve"> </w:t>
-      </w:r>
-      <w:r>
-        <w:t xml:space="preserve">equal</w:t>
-      </w:r>
-      <w:r>
-        <w:t xml:space="preserve"> </w:t>
-      </w:r>
-      <w:r>
-        <w:t xml:space="preserve">in</w:t>
-      </w:r>
-      <w:r>
-        <w:t xml:space="preserve"> </w:t>
-      </w:r>
-      <w:r>
-        <w:t xml:space="preserve">dignity</w:t>
-      </w:r>
-      <w:r>
-        <w:t xml:space="preserve"> </w:t>
-      </w:r>
-      <w:r>
-        <w:t xml:space="preserve">and</w:t>
-      </w:r>
-      <w:r>
-        <w:t xml:space="preserve"> </w:t>
-      </w:r>
-      <w:r>
-        <w:t xml:space="preserve">rights.</w:t>
+        <w:t xml:space="preserve">All human beings are born free and equal in dignity and rights. All human beings are born free and equal in dignity and rights. All human beings are born free and equal in dignity and rights. All human beings are born free and equal in dignity and rights.</w:t>
       </w:r>
     </w:p>
     <w:sdt>
@@ -424,7 +94,59 @@
         </w:p>
       </w:sdtContent>
     </w:sdt>
-    <w:bookmarkStart w:id="48" w:name="heading-1"/>
+    <w:sdt>
+      <w:sdtPr>
+        <w:docPartObj>
+          <w:docPartGallery w:val="List of Figures"/>
+          <w:docPartUnique/>
+        </w:docPartObj>
+      </w:sdtPr>
+      <w:sdtContent>
+        <w:p>
+          <w:pPr>
+            <w:pStyle w:val="TOCHeading"/>
+          </w:pPr>
+          <w:r>
+            <w:t xml:space="preserve">List of Figures</w:t>
+          </w:r>
+        </w:p>
+        <w:p>
+          <w:r>
+            <w:fldChar w:fldCharType="begin" w:dirty="true"/>
+            <w:instrText xml:space="preserve">TOC \h \z \t "Image Caption" \c</w:instrText>
+            <w:fldChar w:fldCharType="separate"/>
+            <w:fldChar w:fldCharType="end"/>
+          </w:r>
+        </w:p>
+      </w:sdtContent>
+    </w:sdt>
+    <w:sdt>
+      <w:sdtPr>
+        <w:docPartObj>
+          <w:docPartGallery w:val="List of Tables"/>
+          <w:docPartUnique/>
+        </w:docPartObj>
+      </w:sdtPr>
+      <w:sdtContent>
+        <w:p>
+          <w:pPr>
+            <w:pStyle w:val="TOCHeading"/>
+          </w:pPr>
+          <w:r>
+            <w:t xml:space="preserve">List of Tables</w:t>
+          </w:r>
+        </w:p>
+        <w:p>
+          <w:r>
+            <w:fldChar w:fldCharType="begin" w:dirty="true"/>
+            <w:instrText xml:space="preserve">TOC \h \z \t "Table Caption" \c</w:instrText>
+            <w:fldChar w:fldCharType="separate"/>
+            <w:fldChar w:fldCharType="end"/>
+          </w:r>
+        </w:p>
+      </w:sdtContent>
+    </w:sdt>
+    <w:bookmarkStart w:id="37" w:name="heading-1"/>
     <w:p>
       <w:pPr>
         <w:pStyle w:val="Heading1"/>
@@ -441,7 +163,7 @@
         <w:t xml:space="preserve">All human beings are born free and equal in dignity and rights. All human beings are born free and equal in dignity and rights. All human beings are born free and equal in dignity and rights. All human beings are born free and equal in dignity and rights.</w:t>
       </w:r>
     </w:p>
-    <w:bookmarkStart w:id="24" w:name="heading-2"/>
+    <w:bookmarkStart w:id="13" w:name="heading-2"/>
     <w:p>
       <w:pPr>
         <w:pStyle w:val="Heading2"/>
@@ -458,7 +180,7 @@
         <w:t xml:space="preserve">All human beings are born free and equal in dignity and rights. All human beings are born free and equal in dignity and rights. All human beings are born free and equal in dignity and rights. All human beings are born free and equal in dignity and rights.</w:t>
       </w:r>
     </w:p>
-    <w:bookmarkStart w:id="23" w:name="heading-3"/>
+    <w:bookmarkStart w:id="12" w:name="heading-3"/>
     <w:p>
       <w:pPr>
         <w:pStyle w:val="Heading3"/>
@@ -475,7 +197,7 @@
         <w:t xml:space="preserve">All human beings are born free and equal in dignity and rights. All human beings are born free and equal in dignity and rights. All human beings are born free and equal in dignity and rights. All human beings are born free and equal in dignity and rights.</w:t>
       </w:r>
     </w:p>
-    <w:bookmarkStart w:id="22" w:name="heading-4"/>
+    <w:bookmarkStart w:id="11" w:name="heading-4"/>
     <w:p>
       <w:pPr>
         <w:pStyle w:val="Heading4"/>
@@ -492,10 +214,10 @@
         <w:t xml:space="preserve">All human beings are born free and equal in dignity and rights. All human beings are born free and equal in dignity and rights. All human beings are born free and equal in dignity and rights. All human beings are born free and equal in dignity and rights.</w:t>
       </w:r>
     </w:p>
-    <w:bookmarkEnd w:id="22"/>
-    <w:bookmarkEnd w:id="23"/>
-    <w:bookmarkEnd w:id="24"/>
-    <w:bookmarkStart w:id="25" w:name="bold"/>
+    <w:bookmarkEnd w:id="11"/>
+    <w:bookmarkEnd w:id="12"/>
+    <w:bookmarkEnd w:id="13"/>
+    <w:bookmarkStart w:id="14" w:name="bold"/>
     <w:p>
       <w:pPr>
         <w:pStyle w:val="Heading2"/>
@@ -510,8 +232,8 @@
       </w:pPr>
       <w:r>
         <w:rPr>
+          <w:b/>
           <w:bCs/>
-          <w:b/>
         </w:rPr>
         <w:t xml:space="preserve">All human beings are born free and equal in dignity and rights.</w:t>
       </w:r>
@@ -522,8 +244,8 @@
         <w:t xml:space="preserve">All human beings are born free and equal in dignity and rights.All human beings are born free and equal in dignity and rights.All human beings are born free and equal in dignity and rights.</w:t>
       </w:r>
     </w:p>
-    <w:bookmarkEnd w:id="25"/>
-    <w:bookmarkStart w:id="26" w:name="italic"/>
+    <w:bookmarkEnd w:id="14"/>
+    <w:bookmarkStart w:id="15" w:name="italic"/>
     <w:p>
       <w:pPr>
         <w:pStyle w:val="Heading2"/>
@@ -538,8 +260,8 @@
       </w:pPr>
       <w:r>
         <w:rPr>
+          <w:i/>
           <w:iCs/>
-          <w:i/>
         </w:rPr>
         <w:t xml:space="preserve">All human beings are born free and equal in dignity and rights.</w:t>
       </w:r>
@@ -550,8 +272,8 @@
         <w:t xml:space="preserve">All human beings are born free and equal in dignity and rights.All human beings are born free and equal in dignity and rights.All human beings are born free and equal in dignity and rights.</w:t>
       </w:r>
     </w:p>
-    <w:bookmarkEnd w:id="26"/>
-    <w:bookmarkStart w:id="27" w:name="bold-and-italic"/>
+    <w:bookmarkEnd w:id="15"/>
+    <w:bookmarkStart w:id="16" w:name="bold-and-italic"/>
     <w:p>
       <w:pPr>
         <w:pStyle w:val="Heading2"/>
@@ -566,10 +288,10 @@
       </w:pPr>
       <w:r>
         <w:rPr>
+          <w:b/>
+          <w:bCs/>
+          <w:i/>
           <w:iCs/>
-          <w:i/>
-          <w:bCs/>
-          <w:b/>
         </w:rPr>
         <w:t xml:space="preserve">All human beings are born free and equal in dignity and rights.</w:t>
       </w:r>
@@ -580,8 +302,8 @@
         <w:t xml:space="preserve">All human beings are born free and equal in dignity and rights.All human beings are born free and equal in dignity and rights.All human beings are born free and equal in dignity and rights.</w:t>
       </w:r>
     </w:p>
-    <w:bookmarkEnd w:id="27"/>
-    <w:bookmarkStart w:id="28" w:name="struck-through"/>
+    <w:bookmarkEnd w:id="16"/>
+    <w:bookmarkStart w:id="17" w:name="struck-through"/>
     <w:p>
       <w:pPr>
         <w:pStyle w:val="Heading2"/>
@@ -607,8 +329,8 @@
         <w:t xml:space="preserve">All human beings are born free and equal in dignity and rights.All human beings are born free and equal in dignity and rights.All human beings are born free and equal in dignity and rights.</w:t>
       </w:r>
     </w:p>
-    <w:bookmarkEnd w:id="28"/>
-    <w:bookmarkStart w:id="29" w:name="numbered-lists"/>
+    <w:bookmarkEnd w:id="17"/>
+    <w:bookmarkStart w:id="18" w:name="numbered-lists"/>
     <w:p>
       <w:pPr>
         <w:pStyle w:val="Heading2"/>
@@ -619,167 +341,167 @@
     </w:p>
     <w:p>
       <w:pPr>
+        <w:pStyle w:val="Compact"/>
         <w:numPr>
           <w:ilvl w:val="0"/>
           <w:numId w:val="1001"/>
         </w:numPr>
+      </w:pPr>
+      <w:r>
+        <w:t xml:space="preserve">All human beings are born free and equal in dignity and rights.</w:t>
+      </w:r>
+    </w:p>
+    <w:p>
+      <w:pPr>
         <w:pStyle w:val="Compact"/>
-      </w:pPr>
-      <w:r>
-        <w:t xml:space="preserve">All human beings are born free and equal in dignity and rights.</w:t>
-      </w:r>
-    </w:p>
-    <w:p>
-      <w:pPr>
         <w:numPr>
           <w:ilvl w:val="0"/>
           <w:numId w:val="1001"/>
         </w:numPr>
+      </w:pPr>
+      <w:r>
+        <w:t xml:space="preserve">All human beings are born free and equal in dignity and rights.</w:t>
+      </w:r>
+    </w:p>
+    <w:p>
+      <w:pPr>
         <w:pStyle w:val="Compact"/>
-      </w:pPr>
-      <w:r>
-        <w:t xml:space="preserve">All human beings are born free and equal in dignity and rights.</w:t>
-      </w:r>
-    </w:p>
-    <w:p>
-      <w:pPr>
         <w:numPr>
           <w:ilvl w:val="0"/>
           <w:numId w:val="1001"/>
         </w:numPr>
+      </w:pPr>
+      <w:r>
+        <w:t xml:space="preserve">All human beings are born free and equal in dignity and rights.</w:t>
+      </w:r>
+    </w:p>
+    <w:p>
+      <w:pPr>
         <w:pStyle w:val="Compact"/>
-      </w:pPr>
-      <w:r>
-        <w:t xml:space="preserve">All human beings are born free and equal in dignity and rights.</w:t>
-      </w:r>
-    </w:p>
-    <w:p>
-      <w:pPr>
         <w:numPr>
           <w:ilvl w:val="0"/>
           <w:numId w:val="1001"/>
         </w:numPr>
+      </w:pPr>
+      <w:r>
+        <w:t xml:space="preserve">All human beings are born free and equal in dignity and rights.</w:t>
+      </w:r>
+    </w:p>
+    <w:p>
+      <w:pPr>
+        <w:pStyle w:val="FirstParagraph"/>
+      </w:pPr>
+      <w:r>
+        <w:t xml:space="preserve">All human beings are born free and equal in dignity and rights. All human beings are born free and equal in dignity and rights. All human beings are born free and equal in dignity and rights. All human beings are born free and equal in dignity and rights.</w:t>
+      </w:r>
+    </w:p>
+    <w:bookmarkEnd w:id="18"/>
+    <w:bookmarkStart w:id="19" w:name="unnumbered-lists"/>
+    <w:p>
+      <w:pPr>
+        <w:pStyle w:val="Heading2"/>
+      </w:pPr>
+      <w:r>
+        <w:t xml:space="preserve">Unnumbered lists</w:t>
+      </w:r>
+    </w:p>
+    <w:p>
+      <w:pPr>
         <w:pStyle w:val="Compact"/>
-      </w:pPr>
-      <w:r>
-        <w:t xml:space="preserve">All human beings are born free and equal in dignity and rights.</w:t>
-      </w:r>
-    </w:p>
-    <w:p>
-      <w:pPr>
-        <w:pStyle w:val="FirstParagraph"/>
-      </w:pPr>
-      <w:r>
-        <w:t xml:space="preserve">All human beings are born free and equal in dignity and rights. All human beings are born free and equal in dignity and rights. All human beings are born free and equal in dignity and rights. All human beings are born free and equal in dignity and rights.</w:t>
-      </w:r>
-    </w:p>
-    <w:bookmarkEnd w:id="29"/>
-    <w:bookmarkStart w:id="30" w:name="unnumbered-lists"/>
-    <w:p>
-      <w:pPr>
-        <w:pStyle w:val="Heading2"/>
-      </w:pPr>
-      <w:r>
-        <w:t xml:space="preserve">Unnumbered lists</w:t>
-      </w:r>
-    </w:p>
-    <w:p>
-      <w:pPr>
         <w:numPr>
           <w:ilvl w:val="0"/>
           <w:numId w:val="1002"/>
         </w:numPr>
+      </w:pPr>
+      <w:r>
+        <w:t xml:space="preserve">All human beings are born free and equal in dignity and rights.</w:t>
+      </w:r>
+    </w:p>
+    <w:p>
+      <w:pPr>
         <w:pStyle w:val="Compact"/>
-      </w:pPr>
-      <w:r>
-        <w:t xml:space="preserve">All human beings are born free and equal in dignity and rights.</w:t>
-      </w:r>
-    </w:p>
-    <w:p>
-      <w:pPr>
         <w:numPr>
           <w:ilvl w:val="1"/>
           <w:numId w:val="1003"/>
         </w:numPr>
+      </w:pPr>
+      <w:r>
+        <w:t xml:space="preserve">All human beings are born free and equal in dignity and rights.</w:t>
+      </w:r>
+    </w:p>
+    <w:p>
+      <w:pPr>
         <w:pStyle w:val="Compact"/>
-      </w:pPr>
-      <w:r>
-        <w:t xml:space="preserve">All human beings are born free and equal in dignity and rights.</w:t>
-      </w:r>
-    </w:p>
-    <w:p>
-      <w:pPr>
         <w:numPr>
           <w:ilvl w:val="0"/>
           <w:numId w:val="1002"/>
         </w:numPr>
+      </w:pPr>
+      <w:r>
+        <w:t xml:space="preserve">All human beings are born free and equal in dignity and rights.</w:t>
+      </w:r>
+    </w:p>
+    <w:p>
+      <w:pPr>
+        <w:pStyle w:val="FirstParagraph"/>
+      </w:pPr>
+      <w:r>
+        <w:t xml:space="preserve">All human beings are born free and equal in dignity and rights. All human beings are born free and equal in dignity and rights. All human beings are born free and equal in dignity and rights. All human beings are born free and equal in dignity and rights.</w:t>
+      </w:r>
+    </w:p>
+    <w:bookmarkEnd w:id="19"/>
+    <w:bookmarkStart w:id="20" w:name="mixed-lists"/>
+    <w:p>
+      <w:pPr>
+        <w:pStyle w:val="Heading2"/>
+      </w:pPr>
+      <w:r>
+        <w:t xml:space="preserve">Mixed lists</w:t>
+      </w:r>
+    </w:p>
+    <w:p>
+      <w:pPr>
         <w:pStyle w:val="Compact"/>
-      </w:pPr>
-      <w:r>
-        <w:t xml:space="preserve">All human beings are born free and equal in dignity and rights.</w:t>
-      </w:r>
-    </w:p>
-    <w:p>
-      <w:pPr>
-        <w:pStyle w:val="FirstParagraph"/>
-      </w:pPr>
-      <w:r>
-        <w:t xml:space="preserve">All human beings are born free and equal in dignity and rights. All human beings are born free and equal in dignity and rights. All human beings are born free and equal in dignity and rights. All human beings are born free and equal in dignity and rights.</w:t>
-      </w:r>
-    </w:p>
-    <w:bookmarkEnd w:id="30"/>
-    <w:bookmarkStart w:id="31" w:name="mixed-lists"/>
-    <w:p>
-      <w:pPr>
-        <w:pStyle w:val="Heading2"/>
-      </w:pPr>
-      <w:r>
-        <w:t xml:space="preserve">Mixed lists</w:t>
-      </w:r>
-    </w:p>
-    <w:p>
-      <w:pPr>
         <w:numPr>
           <w:ilvl w:val="0"/>
           <w:numId w:val="1004"/>
         </w:numPr>
+      </w:pPr>
+      <w:r>
+        <w:t xml:space="preserve">All human beings are born free and equal in dignity and rights.</w:t>
+      </w:r>
+    </w:p>
+    <w:p>
+      <w:pPr>
         <w:pStyle w:val="Compact"/>
-      </w:pPr>
-      <w:r>
-        <w:t xml:space="preserve">All human beings are born free and equal in dignity and rights.</w:t>
-      </w:r>
-    </w:p>
-    <w:p>
-      <w:pPr>
         <w:numPr>
           <w:ilvl w:val="1"/>
           <w:numId w:val="1005"/>
         </w:numPr>
+      </w:pPr>
+      <w:r>
+        <w:t xml:space="preserve">All human beings are born free and equal in dignity and rights.</w:t>
+      </w:r>
+    </w:p>
+    <w:p>
+      <w:pPr>
         <w:pStyle w:val="Compact"/>
-      </w:pPr>
-      <w:r>
-        <w:t xml:space="preserve">All human beings are born free and equal in dignity and rights.</w:t>
-      </w:r>
-    </w:p>
-    <w:p>
-      <w:pPr>
         <w:numPr>
           <w:ilvl w:val="1"/>
           <w:numId w:val="1005"/>
         </w:numPr>
+      </w:pPr>
+      <w:r>
+        <w:t xml:space="preserve">All human beings are born free and equal in dignity and rights.</w:t>
+      </w:r>
+    </w:p>
+    <w:p>
+      <w:pPr>
         <w:pStyle w:val="Compact"/>
-      </w:pPr>
-      <w:r>
-        <w:t xml:space="preserve">All human beings are born free and equal in dignity and rights.</w:t>
-      </w:r>
-    </w:p>
-    <w:p>
-      <w:pPr>
         <w:numPr>
           <w:ilvl w:val="0"/>
           <w:numId w:val="1004"/>
         </w:numPr>
-        <w:pStyle w:val="Compact"/>
       </w:pPr>
       <w:r>
         <w:t xml:space="preserve">All human beings are born free and equal in dignity and rights.</w:t>
@@ -793,8 +515,8 @@
         <w:t xml:space="preserve">All human beings are born free and equal in dignity and rights. All human beings are born free and equal in dignity and rights. All human beings are born free and equal in dignity and rights. All human beings are born free and equal in dignity and rights.</w:t>
       </w:r>
     </w:p>
-    <w:bookmarkEnd w:id="31"/>
-    <w:bookmarkStart w:id="36" w:name="figures-and-captions"/>
+    <w:bookmarkEnd w:id="20"/>
+    <w:bookmarkStart w:id="25" w:name="figures-and-captions"/>
     <w:p>
       <w:pPr>
         <w:pStyle w:val="Heading2"/>
@@ -812,18 +534,18 @@
           <wp:inline>
             <wp:extent cx="5334000" cy="4030133"/>
             <wp:effectExtent b="0" l="0" r="0" t="0"/>
-            <wp:docPr descr="Eleanor Roosevelt hält die englische Version der Allgemeinen Erklärung der Menschenrechte (FDR Presidential Library &amp; Museum, CC BY 2.0 https://creativecommons.org/licenses/by/2.0, via Wikimedia Commons)" title="" id="33" name="Picture"/>
+            <wp:docPr descr="Eleanor Roosevelt hält die englische Version der Allgemeinen Erklärung der Menschenrechte (FDR Presidential Library &amp; Museum, CC BY 2.0 https://creativecommons.org/licenses/by/2.0, via Wikimedia Commons)" title="" id="22" name="Picture"/>
             <a:graphic>
               <a:graphicData uri="http://schemas.openxmlformats.org/drawingml/2006/picture">
                 <pic:pic>
                   <pic:nvPicPr>
-                    <pic:cNvPr descr="images/Eleanor_Roosevelt_and_Human_Rights_Declaration.jpeg" id="34" name="Picture"/>
+                    <pic:cNvPr descr="images/Eleanor_Roosevelt_and_Human_Rights_Declaration.jpeg" id="23" name="Picture"/>
                     <pic:cNvPicPr>
                       <a:picLocks noChangeArrowheads="1" noChangeAspect="1"/>
                     </pic:cNvPicPr>
                   </pic:nvPicPr>
                   <pic:blipFill>
-                    <a:blip r:embed="rId32"/>
+                    <a:blip r:embed="rId21"/>
                     <a:stretch>
                       <a:fillRect/>
                     </a:stretch>
@@ -860,7 +582,7 @@
       <w:r>
         <w:t xml:space="preserve"> </w:t>
       </w:r>
-      <w:hyperlink r:id="rId35">
+      <w:hyperlink r:id="rId24">
         <w:r>
           <w:rPr>
             <w:rStyle w:val="Hyperlink"/>
@@ -880,8 +602,8 @@
         <w:t xml:space="preserve">All human beings are born free and equal in dignity and rights. All human beings are born free and equal in dignity and rights. All human beings are born free and equal in dignity and rights. All human beings are born free and equal in dignity and rights.</w:t>
       </w:r>
     </w:p>
-    <w:bookmarkEnd w:id="36"/>
-    <w:bookmarkStart w:id="37" w:name="code"/>
+    <w:bookmarkEnd w:id="25"/>
+    <w:bookmarkStart w:id="26" w:name="code"/>
     <w:p>
       <w:pPr>
         <w:pStyle w:val="Heading2"/>
@@ -923,8 +645,8 @@
         <w:t xml:space="preserve">All human beings are born free and equal in dignity and rights. All human beings are born free and equal in dignity and rights. All human beings are born free and equal in dignity and rights. All human beings are born free and equal in dignity and rights.</w:t>
       </w:r>
     </w:p>
-    <w:bookmarkEnd w:id="37"/>
-    <w:bookmarkStart w:id="40" w:name="urls-and-email-addresses"/>
+    <w:bookmarkEnd w:id="26"/>
+    <w:bookmarkStart w:id="29" w:name="urls-and-email-addresses"/>
     <w:p>
       <w:pPr>
         <w:pStyle w:val="Heading2"/>
@@ -937,7 +659,7 @@
       <w:pPr>
         <w:pStyle w:val="FirstParagraph"/>
       </w:pPr>
-      <w:hyperlink r:id="rId38">
+      <w:hyperlink r:id="rId27">
         <w:r>
           <w:rPr>
             <w:rStyle w:val="Hyperlink"/>
@@ -951,7 +673,7 @@
       <w:r>
         <w:t xml:space="preserve"> </w:t>
       </w:r>
-      <w:hyperlink r:id="rId39">
+      <w:hyperlink r:id="rId28">
         <w:r>
           <w:rPr>
             <w:rStyle w:val="Hyperlink"/>
@@ -963,8 +685,8 @@
         <w:t xml:space="preserve">. All human beings are born free and equal in dignity and rights. All human beings are born free and equal in dignity and rights. All human beings are born free and equal in dignity and rights. All human beings are born free and equal in dignity and rights.</w:t>
       </w:r>
     </w:p>
-    <w:bookmarkEnd w:id="40"/>
-    <w:bookmarkStart w:id="41" w:name="tables"/>
+    <w:bookmarkEnd w:id="29"/>
+    <w:bookmarkStart w:id="30" w:name="tables"/>
     <w:p>
       <w:pPr>
         <w:pStyle w:val="Heading2"/>
@@ -985,9 +707,8 @@
       <w:tblPr>
         <w:tblStyle w:val="Table"/>
         <w:tblW w:type="pct" w:w="5000"/>
+        <w:tblLayout w:type="fixed"/>
         <w:tblLook w:firstRow="1" w:lastRow="0" w:firstColumn="0" w:lastColumn="0" w:noHBand="0" w:noVBand="0" w:val="0020"/>
-        <w:jc w:val="start"/>
-        <w:tblLayout w:type="fixed"/>
         <w:tblCaption w:val="Table caption"/>
       </w:tblPr>
       <w:tblGrid>
@@ -996,14 +717,13 @@
       </w:tblGrid>
       <w:tr>
         <w:trPr>
-          <w:tblHeader w:val="true"/>
+          <w:tblHeader w:val="on"/>
         </w:trPr>
         <w:tc>
           <w:tcPr/>
           <w:p>
             <w:pPr>
               <w:pStyle w:val="Compact"/>
-              <w:jc w:val="left"/>
             </w:pPr>
             <w:r>
               <w:t xml:space="preserve">column 1</w:t>
@@ -1015,7 +735,6 @@
           <w:p>
             <w:pPr>
               <w:pStyle w:val="Compact"/>
-              <w:jc w:val="left"/>
             </w:pPr>
             <w:r>
               <w:t xml:space="preserve">column 2</w:t>
@@ -1029,7 +748,6 @@
           <w:p>
             <w:pPr>
               <w:pStyle w:val="Compact"/>
-              <w:jc w:val="left"/>
             </w:pPr>
             <w:r>
               <w:t xml:space="preserve">All human beings are born free and equal in dignity and rights.</w:t>
@@ -1041,7 +759,6 @@
           <w:p>
             <w:pPr>
               <w:pStyle w:val="Compact"/>
-              <w:jc w:val="left"/>
             </w:pPr>
             <w:r>
               <w:t xml:space="preserve">All human beings are born free and equal in dignity and rights.</w:t>
@@ -1055,7 +772,6 @@
           <w:p>
             <w:pPr>
               <w:pStyle w:val="Compact"/>
-              <w:jc w:val="left"/>
             </w:pPr>
             <w:r>
               <w:t xml:space="preserve">All human beings are born free and equal in dignity and rights.</w:t>
@@ -1067,7 +783,6 @@
           <w:p>
             <w:pPr>
               <w:pStyle w:val="Compact"/>
-              <w:jc w:val="left"/>
             </w:pPr>
             <w:r>
               <w:t xml:space="preserve">All human beings are born free and equal in dignity and rights.</w:t>
@@ -1081,7 +796,6 @@
           <w:p>
             <w:pPr>
               <w:pStyle w:val="Compact"/>
-              <w:jc w:val="left"/>
             </w:pPr>
             <w:r>
               <w:t xml:space="preserve">All human beings are born free and equal in dignity and rights.</w:t>
@@ -1093,7 +807,6 @@
           <w:p>
             <w:pPr>
               <w:pStyle w:val="Compact"/>
-              <w:jc w:val="left"/>
             </w:pPr>
             <w:r>
               <w:t xml:space="preserve">All human beings are born free and equal in dignity and rights.</w:t>
@@ -1107,7 +820,6 @@
           <w:p>
             <w:pPr>
               <w:pStyle w:val="Compact"/>
-              <w:jc w:val="left"/>
             </w:pPr>
             <w:r>
               <w:t xml:space="preserve">All human beings are born free and equal in dignity and rights.</w:t>
@@ -1119,7 +831,6 @@
           <w:p>
             <w:pPr>
               <w:pStyle w:val="Compact"/>
-              <w:jc w:val="left"/>
             </w:pPr>
             <w:r>
               <w:t xml:space="preserve">All human beings are born free and equal in dignity and rights.</w:t>
@@ -1136,8 +847,8 @@
         <w:t xml:space="preserve">All human beings are born free and equal in dignity and rights. All human beings are born free and equal in dignity and rights. All human beings are born free and equal in dignity and rights. All human beings are born free and equal in dignity and rights.</w:t>
       </w:r>
     </w:p>
-    <w:bookmarkEnd w:id="41"/>
-    <w:bookmarkStart w:id="43" w:name="footnotes"/>
+    <w:bookmarkEnd w:id="30"/>
+    <w:bookmarkStart w:id="32" w:name="footnotes"/>
     <w:p>
       <w:pPr>
         <w:pStyle w:val="Heading2"/>
@@ -1157,11 +868,11 @@
         <w:rPr>
           <w:rStyle w:val="FootnoteReference"/>
         </w:rPr>
-        <w:footnoteReference w:id="42"/>
-      </w:r>
-    </w:p>
-    <w:bookmarkEnd w:id="43"/>
-    <w:bookmarkStart w:id="44" w:name="quotes"/>
+        <w:footnoteReference w:id="31"/>
+      </w:r>
+    </w:p>
+    <w:bookmarkEnd w:id="32"/>
+    <w:bookmarkStart w:id="33" w:name="quotes"/>
     <w:p>
       <w:pPr>
         <w:pStyle w:val="Heading2"/>
@@ -1189,8 +900,8 @@
         <w:t xml:space="preserve">All human beings are born free and equal in dignity and rights. All human beings are born free and equal in dignity and rights. All human beings are born free and equal in dignity and rights. All human beings are born free and equal in dignity and rights.</w:t>
       </w:r>
     </w:p>
-    <w:bookmarkEnd w:id="44"/>
-    <w:bookmarkStart w:id="47" w:name="scientific-citations"/>
+    <w:bookmarkEnd w:id="33"/>
+    <w:bookmarkStart w:id="36" w:name="scientific-citations"/>
     <w:p>
       <w:pPr>
         <w:pStyle w:val="Heading2"/>
@@ -1216,7 +927,7 @@
         <w:rPr>
           <w:rStyle w:val="FootnoteReference"/>
         </w:rPr>
-        <w:footnoteReference w:id="45"/>
+        <w:footnoteReference w:id="34"/>
       </w:r>
     </w:p>
     <w:p>
@@ -1230,12 +941,12 @@
         <w:rPr>
           <w:rStyle w:val="FootnoteReference"/>
         </w:rPr>
-        <w:footnoteReference w:id="46"/>
-      </w:r>
-    </w:p>
-    <w:bookmarkEnd w:id="47"/>
-    <w:bookmarkEnd w:id="48"/>
-    <w:bookmarkStart w:id="52" w:name="bibliography"/>
+        <w:footnoteReference w:id="35"/>
+      </w:r>
+    </w:p>
+    <w:bookmarkEnd w:id="36"/>
+    <w:bookmarkEnd w:id="37"/>
+    <w:bookmarkStart w:id="41" w:name="bibliography"/>
     <w:p>
       <w:pPr>
         <w:pStyle w:val="Heading1"/>
@@ -1244,8 +955,8 @@
         <w:t xml:space="preserve">Bibliography</w:t>
       </w:r>
     </w:p>
-    <w:bookmarkStart w:id="51" w:name="refs"/>
-    <w:bookmarkStart w:id="49" w:name="ref-brown2016"/>
+    <w:bookmarkStart w:id="40" w:name="refs"/>
+    <w:bookmarkStart w:id="38" w:name="ref-brown2016"/>
     <w:p>
       <w:pPr>
         <w:pStyle w:val="Bibliography"/>
@@ -1258,92 +969,92 @@
       </w:r>
       <w:r>
         <w:rPr>
+          <w:i/>
           <w:iCs/>
-          <w:i/>
         </w:rPr>
         <w:t xml:space="preserve">The</w:t>
       </w:r>
       <w:r>
         <w:rPr>
+          <w:i/>
           <w:iCs/>
-          <w:i/>
         </w:rPr>
         <w:t xml:space="preserve"> </w:t>
       </w:r>
       <w:r>
         <w:rPr>
+          <w:i/>
           <w:iCs/>
-          <w:i/>
         </w:rPr>
         <w:t xml:space="preserve">Universal</w:t>
       </w:r>
       <w:r>
         <w:rPr>
+          <w:i/>
           <w:iCs/>
-          <w:i/>
         </w:rPr>
         <w:t xml:space="preserve"> </w:t>
       </w:r>
       <w:r>
         <w:rPr>
+          <w:i/>
           <w:iCs/>
-          <w:i/>
         </w:rPr>
         <w:t xml:space="preserve">Declaration</w:t>
       </w:r>
       <w:r>
         <w:rPr>
+          <w:i/>
           <w:iCs/>
-          <w:i/>
         </w:rPr>
         <w:t xml:space="preserve"> </w:t>
       </w:r>
       <w:r>
         <w:rPr>
+          <w:i/>
           <w:iCs/>
-          <w:i/>
         </w:rPr>
         <w:t xml:space="preserve">of</w:t>
       </w:r>
       <w:r>
         <w:rPr>
+          <w:i/>
           <w:iCs/>
-          <w:i/>
         </w:rPr>
         <w:t xml:space="preserve"> </w:t>
       </w:r>
       <w:r>
         <w:rPr>
+          <w:i/>
           <w:iCs/>
-          <w:i/>
         </w:rPr>
         <w:t xml:space="preserve">Human</w:t>
       </w:r>
       <w:r>
         <w:rPr>
+          <w:i/>
           <w:iCs/>
-          <w:i/>
         </w:rPr>
         <w:t xml:space="preserve"> </w:t>
       </w:r>
       <w:r>
         <w:rPr>
+          <w:i/>
           <w:iCs/>
-          <w:i/>
         </w:rPr>
         <w:t xml:space="preserve">Rights</w:t>
       </w:r>
       <w:r>
         <w:rPr>
+          <w:i/>
           <w:iCs/>
-          <w:i/>
         </w:rPr>
         <w:t xml:space="preserve"> </w:t>
       </w:r>
       <w:r>
         <w:rPr>
+          <w:i/>
           <w:iCs/>
-          <w:i/>
         </w:rPr>
         <w:t xml:space="preserve">in the 21st Century, a Living Document in a Changing World</w:t>
       </w:r>
@@ -1351,8 +1062,8 @@
         <w:t xml:space="preserve">. Cambridge, [New York]: Open Book Publishers ; NYU Global Institute for Advanced Study, 2016.</w:t>
       </w:r>
     </w:p>
-    <w:bookmarkEnd w:id="49"/>
-    <w:bookmarkStart w:id="50" w:name="ref-unitednations1948"/>
+    <w:bookmarkEnd w:id="38"/>
+    <w:bookmarkStart w:id="39" w:name="ref-unitednations1948"/>
     <w:p>
       <w:pPr>
         <w:pStyle w:val="Bibliography"/>
@@ -1365,19 +1076,23 @@
       </w:r>
       <w:r>
         <w:rPr>
+          <w:i/>
           <w:iCs/>
-          <w:i/>
         </w:rPr>
         <w:t xml:space="preserve">Universal Declaration of Human Rights</w:t>
       </w:r>
       <w:r>
-        <w:t xml:space="preserve">, 1948.</w:t>
-      </w:r>
-    </w:p>
-    <w:bookmarkEnd w:id="50"/>
-    <w:bookmarkEnd w:id="51"/>
-    <w:bookmarkEnd w:id="52"/>
-    <w:sectPr/>
+        <w:t xml:space="preserve">. 1948.</w:t>
+      </w:r>
+    </w:p>
+    <w:bookmarkEnd w:id="39"/>
+    <w:bookmarkEnd w:id="40"/>
+    <w:bookmarkEnd w:id="41"/>
+    <w:sectPr>
+      <w:footnotePr>
+        <w:numRestart w:val="eachSect"/>
+      </w:footnotePr>
+    </w:sectPr>
   </w:body>
 </w:document>
 </file>
@@ -1402,7 +1117,7 @@
       </w:r>
     </w:p>
   </w:footnote>
-  <w:footnote w:id="42">
+  <w:footnote w:id="31">
     <w:p>
       <w:pPr>
         <w:pStyle w:val="FootnoteText"/>
@@ -1421,7 +1136,7 @@
       </w:r>
     </w:p>
   </w:footnote>
-  <w:footnote w:id="45">
+  <w:footnote w:id="34">
     <w:p>
       <w:pPr>
         <w:pStyle w:val="FootnoteText"/>
@@ -1437,17 +1152,20 @@
       </w:r>
       <w:r>
         <w:rPr>
+          <w:i/>
           <w:iCs/>
-          <w:i/>
         </w:rPr>
         <w:t xml:space="preserve">Universal Declaration of Human Rights</w:t>
       </w:r>
       <w:r>
-        <w:t xml:space="preserve">.</w:t>
+        <w:t xml:space="preserve"> </w:t>
+      </w:r>
+      <w:r>
+        <w:t xml:space="preserve">(1948).</w:t>
       </w:r>
     </w:p>
   </w:footnote>
-  <w:footnote w:id="46">
+  <w:footnote w:id="35">
     <w:p>
       <w:pPr>
         <w:pStyle w:val="FootnoteText"/>
@@ -1472,14 +1190,14 @@
 <file path=word/numbering.xml><?xml version="1.0" encoding="utf-8"?>
 <w:numbering xmlns:w="http://schemas.openxmlformats.org/wordprocessingml/2006/main">
   <w:abstractNum w:abstractNumId="990">
-    <w:nsid w:val="A990"/>
+    <w:nsid w:val="0000A990"/>
     <w:multiLevelType w:val="multilevel"/>
     <w:lvl w:ilvl="0">
       <w:numFmt w:val="bullet"/>
       <w:lvlText w:val=" "/>
       <w:lvlJc w:val="left"/>
       <w:pPr>
-        <w:ind w:left="720" w:hanging="480"/>
+        <w:ind w:left="720" w:hanging="360"/>
       </w:pPr>
     </w:lvl>
     <w:lvl w:ilvl="1">
@@ -1487,7 +1205,7 @@
       <w:lvlText w:val=" "/>
       <w:lvlJc w:val="left"/>
       <w:pPr>
-        <w:ind w:left="1440" w:hanging="480"/>
+        <w:ind w:left="1440" w:hanging="360"/>
       </w:pPr>
     </w:lvl>
     <w:lvl w:ilvl="2">
@@ -1495,7 +1213,7 @@
       <w:lvlText w:val=" "/>
       <w:lvlJc w:val="left"/>
       <w:pPr>
-        <w:ind w:left="2160" w:hanging="480"/>
+        <w:ind w:left="2160" w:hanging="360"/>
       </w:pPr>
     </w:lvl>
     <w:lvl w:ilvl="3">
@@ -1503,7 +1221,7 @@
       <w:lvlText w:val=" "/>
       <w:lvlJc w:val="left"/>
       <w:pPr>
-        <w:ind w:left="2880" w:hanging="480"/>
+        <w:ind w:left="2880" w:hanging="360"/>
       </w:pPr>
     </w:lvl>
     <w:lvl w:ilvl="4">
@@ -1511,7 +1229,7 @@
       <w:lvlText w:val=" "/>
       <w:lvlJc w:val="left"/>
       <w:pPr>
-        <w:ind w:left="3600" w:hanging="480"/>
+        <w:ind w:left="3600" w:hanging="360"/>
       </w:pPr>
     </w:lvl>
     <w:lvl w:ilvl="5">
@@ -1519,7 +1237,7 @@
       <w:lvlText w:val=" "/>
       <w:lvlJc w:val="left"/>
       <w:pPr>
-        <w:ind w:left="4320" w:hanging="480"/>
+        <w:ind w:left="4320" w:hanging="360"/>
       </w:pPr>
     </w:lvl>
     <w:lvl w:ilvl="6">
@@ -1527,7 +1245,7 @@
       <w:lvlText w:val=" "/>
       <w:lvlJc w:val="left"/>
       <w:pPr>
-        <w:ind w:left="5040" w:hanging="480"/>
+        <w:ind w:left="5040" w:hanging="360"/>
       </w:pPr>
     </w:lvl>
     <w:lvl w:ilvl="7">
@@ -1535,7 +1253,7 @@
       <w:lvlText w:val=" "/>
       <w:lvlJc w:val="left"/>
       <w:pPr>
-        <w:ind w:left="5760" w:hanging="480"/>
+        <w:ind w:left="5760" w:hanging="360"/>
       </w:pPr>
     </w:lvl>
     <w:lvl w:ilvl="8">
@@ -1543,12 +1261,12 @@
       <w:lvlText w:val=" "/>
       <w:lvlJc w:val="left"/>
       <w:pPr>
-        <w:ind w:left="6480" w:hanging="480"/>
+        <w:ind w:left="6480" w:hanging="360"/>
       </w:pPr>
     </w:lvl>
   </w:abstractNum>
   <w:abstractNum w:abstractNumId="99411">
-    <w:nsid w:val="A99411"/>
+    <w:nsid w:val="00A99411"/>
     <w:multiLevelType w:val="multilevel"/>
     <w:lvl w:ilvl="0">
       <w:start w:val="1"/>
@@ -1556,7 +1274,7 @@
       <w:lvlText w:val="%1."/>
       <w:lvlJc w:val="left"/>
       <w:pPr>
-        <w:ind w:left="720" w:hanging="480"/>
+        <w:ind w:left="720" w:hanging="360"/>
       </w:pPr>
     </w:lvl>
     <w:lvl w:ilvl="1">
@@ -1565,7 +1283,7 @@
       <w:lvlText w:val="%2."/>
       <w:lvlJc w:val="left"/>
       <w:pPr>
-        <w:ind w:left="1440" w:hanging="480"/>
+        <w:ind w:left="1440" w:hanging="360"/>
       </w:pPr>
     </w:lvl>
     <w:lvl w:ilvl="2">
@@ -1574,7 +1292,7 @@
       <w:lvlText w:val="%3."/>
       <w:lvlJc w:val="left"/>
       <w:pPr>
-        <w:ind w:left="2160" w:hanging="480"/>
+        <w:ind w:left="2160" w:hanging="360"/>
       </w:pPr>
     </w:lvl>
     <w:lvl w:ilvl="3">
@@ -1583,7 +1301,7 @@
       <w:lvlText w:val="%4."/>
       <w:lvlJc w:val="left"/>
       <w:pPr>
-        <w:ind w:left="2880" w:hanging="480"/>
+        <w:ind w:left="2880" w:hanging="360"/>
       </w:pPr>
     </w:lvl>
     <w:lvl w:ilvl="4">
@@ -1592,7 +1310,7 @@
       <w:lvlText w:val="%5."/>
       <w:lvlJc w:val="left"/>
       <w:pPr>
-        <w:ind w:left="3600" w:hanging="480"/>
+        <w:ind w:left="3600" w:hanging="360"/>
       </w:pPr>
     </w:lvl>
     <w:lvl w:ilvl="5">
@@ -1601,7 +1319,7 @@
       <w:lvlText w:val="%6."/>
       <w:lvlJc w:val="left"/>
       <w:pPr>
-        <w:ind w:left="4320" w:hanging="480"/>
+        <w:ind w:left="4320" w:hanging="360"/>
       </w:pPr>
     </w:lvl>
     <w:lvl w:ilvl="6">
@@ -1610,7 +1328,7 @@
       <w:lvlText w:val="%7."/>
       <w:lvlJc w:val="left"/>
       <w:pPr>
-        <w:ind w:left="5040" w:hanging="480"/>
+        <w:ind w:left="5040" w:hanging="360"/>
       </w:pPr>
     </w:lvl>
     <w:lvl w:ilvl="7">
@@ -1619,7 +1337,7 @@
       <w:lvlText w:val="%8."/>
       <w:lvlJc w:val="left"/>
       <w:pPr>
-        <w:ind w:left="5760" w:hanging="480"/>
+        <w:ind w:left="5760" w:hanging="360"/>
       </w:pPr>
     </w:lvl>
     <w:lvl w:ilvl="8">
@@ -1628,84 +1346,111 @@
       <w:lvlText w:val="%9."/>
       <w:lvlJc w:val="left"/>
       <w:pPr>
-        <w:ind w:left="6480" w:hanging="480"/>
+        <w:ind w:left="6480" w:hanging="360"/>
       </w:pPr>
     </w:lvl>
   </w:abstractNum>
   <w:abstractNum w:abstractNumId="991">
-    <w:nsid w:val="A991"/>
+    <w:nsid w:val="0000A991"/>
     <w:multiLevelType w:val="multilevel"/>
     <w:lvl w:ilvl="0">
       <w:numFmt w:val="bullet"/>
-      <w:lvlText w:val="•"/>
+      <w:lvlText w:val=""/>
       <w:lvlJc w:val="left"/>
       <w:pPr>
-        <w:ind w:left="720" w:hanging="480"/>
-      </w:pPr>
+        <w:ind w:left="720" w:hanging="360"/>
+      </w:pPr>
+      <w:rPr>
+        <w:rFonts w:ascii="Symbol" w:hAnsi="Symbol" w:cs="Symbol" w:hint="default"/>
+      </w:rPr>
     </w:lvl>
     <w:lvl w:ilvl="1">
       <w:numFmt w:val="bullet"/>
-      <w:lvlText w:val="–"/>
+      <w:lvlText w:val="o"/>
       <w:lvlJc w:val="left"/>
       <w:pPr>
-        <w:ind w:left="1440" w:hanging="480"/>
-      </w:pPr>
+        <w:ind w:left="1440" w:hanging="360"/>
+      </w:pPr>
+      <w:rPr>
+        <w:rFonts w:ascii="Courier New" w:hAnsi="Courier New" w:cs="Courier New" w:hint="default"/>
+      </w:rPr>
     </w:lvl>
     <w:lvl w:ilvl="2">
       <w:numFmt w:val="bullet"/>
-      <w:lvlText w:val="•"/>
+      <w:lvlText w:val=""/>
       <w:lvlJc w:val="left"/>
       <w:pPr>
-        <w:ind w:left="2160" w:hanging="480"/>
-      </w:pPr>
+        <w:ind w:left="2160" w:hanging="360"/>
+      </w:pPr>
+      <w:rPr>
+        <w:rFonts w:ascii="Wingdings" w:hAnsi="Wingdings" w:cs="Wingdings" w:hint="default"/>
+      </w:rPr>
     </w:lvl>
     <w:lvl w:ilvl="3">
       <w:numFmt w:val="bullet"/>
-      <w:lvlText w:val="–"/>
+      <w:lvlText w:val=""/>
       <w:lvlJc w:val="left"/>
       <w:pPr>
-        <w:ind w:left="2880" w:hanging="480"/>
-      </w:pPr>
+        <w:ind w:left="2880" w:hanging="360"/>
+      </w:pPr>
+      <w:rPr>
+        <w:rFonts w:ascii="Symbol" w:hAnsi="Symbol" w:cs="Symbol" w:hint="default"/>
+      </w:rPr>
     </w:lvl>
     <w:lvl w:ilvl="4">
       <w:numFmt w:val="bullet"/>
-      <w:lvlText w:val="•"/>
+      <w:lvlText w:val="o"/>
       <w:lvlJc w:val="left"/>
       <w:pPr>
-        <w:ind w:left="3600" w:hanging="480"/>
-      </w:pPr>
+        <w:ind w:left="3600" w:hanging="360"/>
+      </w:pPr>
+      <w:rPr>
+        <w:rFonts w:ascii="Courier New" w:hAnsi="Courier New" w:cs="Courier New" w:hint="default"/>
+      </w:rPr>
     </w:lvl>
     <w:lvl w:ilvl="5">
       <w:numFmt w:val="bullet"/>
-      <w:lvlText w:val="–"/>
+      <w:lvlText w:val=""/>
       <w:lvlJc w:val="left"/>
       <w:pPr>
-        <w:ind w:left="4320" w:hanging="480"/>
-      </w:pPr>
+        <w:ind w:left="4320" w:hanging="360"/>
+      </w:pPr>
+      <w:rPr>
+        <w:rFonts w:ascii="Wingdings" w:hAnsi="Wingdings" w:cs="Wingdings" w:hint="default"/>
+      </w:rPr>
     </w:lvl>
     <w:lvl w:ilvl="6">
       <w:numFmt w:val="bullet"/>
-      <w:lvlText w:val="•"/>
+      <w:lvlText w:val=""/>
       <w:lvlJc w:val="left"/>
       <w:pPr>
-        <w:ind w:left="5040" w:hanging="480"/>
-      </w:pPr>
+        <w:ind w:left="5040" w:hanging="360"/>
+      </w:pPr>
+      <w:rPr>
+        <w:rFonts w:ascii="Symbol" w:hAnsi="Symbol" w:cs="Symbol" w:hint="default"/>
+      </w:rPr>
     </w:lvl>
     <w:lvl w:ilvl="7">
       <w:numFmt w:val="bullet"/>
-      <w:lvlText w:val="–"/>
+      <w:lvlText w:val="o"/>
       <w:lvlJc w:val="left"/>
       <w:pPr>
-        <w:ind w:left="5760" w:hanging="480"/>
-      </w:pPr>
+        <w:ind w:left="5760" w:hanging="360"/>
+      </w:pPr>
+      <w:rPr>
+        <w:rFonts w:ascii="Courier New" w:hAnsi="Courier New" w:cs="Courier New" w:hint="default"/>
+      </w:rPr>
     </w:lvl>
     <w:lvl w:ilvl="8">
       <w:numFmt w:val="bullet"/>
-      <w:lvlText w:val="•"/>
+      <w:lvlText w:val=""/>
       <w:lvlJc w:val="left"/>
       <w:pPr>
-        <w:ind w:left="6480" w:hanging="480"/>
-      </w:pPr>
+        <w:ind w:left="6480" w:hanging="360"/>
+      </w:pPr>
+      <w:rPr>
+        <w:rFonts w:ascii="Wingdings" w:hAnsi="Wingdings" w:cs="Wingdings" w:hint="default"/>
+      </w:rPr>
     </w:lvl>
   </w:abstractNum>
   <w:num w:numId="1000">
@@ -1788,10 +1533,10 @@
   <w:docDefaults>
     <w:rPrDefault>
       <w:rPr>
-        <w:rFonts w:asciiTheme="minorHAnsi" w:cstheme="minorBidi" w:eastAsiaTheme="minorHAnsi" w:hAnsiTheme="minorHAnsi"/>
+        <w:rFonts w:asciiTheme="minorHAnsi" w:cstheme="minorBidi" w:eastAsiaTheme="minorEastAsia" w:hAnsiTheme="minorHAnsi"/>
         <w:sz w:val="24"/>
         <w:szCs w:val="24"/>
-        <w:lang w:bidi="ar-SA" w:eastAsia="en-US" w:val="en-US"/>
+        <w:lang w:bidi="ar-SA" w:eastAsia="zh-CN" w:val="en-US"/>
       </w:rPr>
     </w:rPrDefault>
     <w:pPrDefault>
@@ -1809,10 +1554,10 @@
     <w:name w:val="Body Text"/>
     <w:basedOn w:val="Normal"/>
     <w:link w:val="BodyTextChar"/>
+    <w:qFormat/>
     <w:pPr>
       <w:spacing w:after="180" w:before="180"/>
     </w:pPr>
-    <w:qFormat/>
   </w:style>
   <w:style w:customStyle="1" w:styleId="FirstParagraph" w:type="paragraph">
     <w:name w:val="First Paragraph"/>
@@ -1832,57 +1577,94 @@
     <w:name w:val="Title"/>
     <w:basedOn w:val="Normal"/>
     <w:next w:val="BodyText"/>
+    <w:link w:val="TitleChar"/>
+    <w:uiPriority w:val="10"/>
     <w:qFormat/>
+    <w:rsid w:val="00A10FD9"/>
     <w:pPr>
-      <w:keepNext/>
-      <w:keepLines/>
-      <w:spacing w:after="240" w:before="480"/>
+      <w:spacing w:after="80" w:line="240" w:lineRule="auto"/>
+      <w:contextualSpacing/>
       <w:jc w:val="center"/>
     </w:pPr>
     <w:rPr>
       <w:rFonts w:asciiTheme="majorHAnsi" w:cstheme="majorBidi" w:eastAsiaTheme="majorEastAsia" w:hAnsiTheme="majorHAnsi"/>
-      <w:b/>
-      <w:bCs/>
-      <w:color w:themeColor="accent1" w:themeShade="B5" w:val="345A8A"/>
-      <w:sz w:val="36"/>
-      <w:szCs w:val="36"/>
+      <w:sz w:val="56"/>
+      <w:szCs w:val="56"/>
+    </w:rPr>
+  </w:style>
+  <w:style w:customStyle="1" w:styleId="TitleChar" w:type="character">
+    <w:name w:val="Title Char"/>
+    <w:basedOn w:val="DefaultParagraphFont"/>
+    <w:link w:val="Title"/>
+    <w:uiPriority w:val="10"/>
+    <w:rsid w:val="00A10FD9"/>
+    <w:rPr>
+      <w:rFonts w:asciiTheme="majorHAnsi" w:cstheme="majorBidi" w:eastAsiaTheme="majorEastAsia" w:hAnsiTheme="majorHAnsi"/>
+      <w:sz w:val="56"/>
+      <w:szCs w:val="56"/>
     </w:rPr>
   </w:style>
   <w:style w:styleId="Subtitle" w:type="paragraph">
     <w:name w:val="Subtitle"/>
+    <w:basedOn w:val="Title"/>
+    <w:next w:val="BodyText"/>
+    <w:link w:val="SubtitleChar"/>
+    <w:uiPriority w:val="11"/>
+    <w:qFormat/>
+    <w:rsid w:val="00A10FD9"/>
+    <w:pPr>
+      <w:numPr>
+        <w:ilvl w:val="1"/>
+      </w:numPr>
+    </w:pPr>
+    <w:rPr>
+      <w:rFonts w:cstheme="majorBidi" w:eastAsiaTheme="majorEastAsia"/>
+      <w:spacing w:val="15"/>
+      <w:sz w:val="28"/>
+      <w:szCs w:val="28"/>
+    </w:rPr>
+  </w:style>
+  <w:style w:customStyle="1" w:styleId="SubtitleChar" w:type="character">
+    <w:name w:val="Subtitle Char"/>
+    <w:basedOn w:val="DefaultParagraphFont"/>
+    <w:link w:val="Subtitle"/>
+    <w:uiPriority w:val="11"/>
+    <w:rsid w:val="00A10FD9"/>
+    <w:rPr>
+      <w:rFonts w:cstheme="majorBidi" w:eastAsiaTheme="majorEastAsia"/>
+      <w:color w:themeColor="text1" w:themeTint="A6" w:val="595959"/>
+      <w:spacing w:val="15"/>
+      <w:sz w:val="28"/>
+      <w:szCs w:val="28"/>
+    </w:rPr>
+  </w:style>
+  <w:style w:customStyle="1" w:styleId="Author" w:type="paragraph">
+    <w:name w:val="Author"/>
     <w:basedOn w:val="Title"/>
     <w:next w:val="BodyText"/>
     <w:qFormat/>
     <w:pPr>
       <w:keepNext/>
       <w:keepLines/>
-      <w:spacing w:after="240" w:before="240"/>
-      <w:jc w:val="center"/>
     </w:pPr>
     <w:rPr>
-      <w:sz w:val="30"/>
-      <w:szCs w:val="30"/>
-    </w:rPr>
-  </w:style>
-  <w:style w:customStyle="1" w:styleId="Author" w:type="paragraph">
-    <w:name w:val="Author"/>
+      <w:sz w:val="24"/>
+      <w:szCs w:val="24"/>
+    </w:rPr>
+  </w:style>
+  <w:style w:styleId="Date" w:type="paragraph">
+    <w:name w:val="Date"/>
+    <w:basedOn w:val="Title"/>
     <w:next w:val="BodyText"/>
     <w:qFormat/>
     <w:pPr>
       <w:keepNext/>
       <w:keepLines/>
-      <w:jc w:val="center"/>
     </w:pPr>
-  </w:style>
-  <w:style w:styleId="Date" w:type="paragraph">
-    <w:name w:val="Date"/>
-    <w:next w:val="BodyText"/>
-    <w:qFormat/>
-    <w:pPr>
-      <w:keepNext/>
-      <w:keepLines/>
-      <w:jc w:val="center"/>
-    </w:pPr>
+    <w:rPr>
+      <w:sz w:val="24"/>
+      <w:szCs w:val="24"/>
+    </w:rPr>
   </w:style>
   <w:style w:customStyle="1" w:styleId="AbstractTitle" w:type="paragraph">
     <w:name w:val="Abstract Title"/>
@@ -1892,15 +1674,13 @@
     <w:pPr>
       <w:keepNext/>
       <w:keepLines/>
+      <w:spacing w:after="0" w:before="300"/>
       <w:jc w:val="center"/>
-      <w:spacing w:after="0" w:before="300"/>
     </w:pPr>
     <w:rPr>
+      <w:b/>
       <w:sz w:val="20"/>
       <w:szCs w:val="20"/>
-      <w:b/>
-      <w:color w:val="345A8A"/>
-      &gt;
     </w:rPr>
   </w:style>
   <w:style w:customStyle="1" w:styleId="Abstract" w:type="paragraph">
@@ -1927,191 +1707,321 @@
     <w:rPr/>
   </w:style>
   <w:style w:styleId="Heading1" w:type="paragraph">
-    <w:name w:val="Heading 1"/>
+    <w:name w:val="heading 1"/>
     <w:basedOn w:val="Normal"/>
     <w:next w:val="BodyText"/>
+    <w:link w:val="Heading1Char"/>
     <w:uiPriority w:val="9"/>
     <w:qFormat/>
+    <w:rsid w:val="00A10FD9"/>
     <w:pPr>
       <w:keepNext/>
       <w:keepLines/>
-      <w:spacing w:after="0" w:before="480"/>
+      <w:spacing w:after="80" w:before="360"/>
       <w:outlineLvl w:val="0"/>
     </w:pPr>
     <w:rPr>
       <w:rFonts w:asciiTheme="majorHAnsi" w:cstheme="majorBidi" w:eastAsiaTheme="majorEastAsia" w:hAnsiTheme="majorHAnsi"/>
-      <w:b/>
-      <w:bCs/>
-      <w:color w:themeColor="accent1" w:val="4F81BD"/>
-      <w:sz w:val="32"/>
-      <w:szCs w:val="32"/>
+      <w:color w:themeColor="accent1" w:themeShade="BF" w:val="0F4761"/>
+      <w:sz w:val="40"/>
+      <w:szCs w:val="40"/>
     </w:rPr>
   </w:style>
   <w:style w:styleId="Heading2" w:type="paragraph">
-    <w:name w:val="Heading 2"/>
+    <w:name w:val="heading 2"/>
     <w:basedOn w:val="Normal"/>
     <w:next w:val="BodyText"/>
+    <w:link w:val="Heading2Char"/>
     <w:uiPriority w:val="9"/>
+    <w:semiHidden/>
     <w:unhideWhenUsed/>
     <w:qFormat/>
+    <w:rsid w:val="00A10FD9"/>
     <w:pPr>
       <w:keepNext/>
       <w:keepLines/>
-      <w:spacing w:after="0" w:before="200"/>
+      <w:spacing w:after="80" w:before="160"/>
       <w:outlineLvl w:val="1"/>
     </w:pPr>
     <w:rPr>
       <w:rFonts w:asciiTheme="majorHAnsi" w:cstheme="majorBidi" w:eastAsiaTheme="majorEastAsia" w:hAnsiTheme="majorHAnsi"/>
-      <w:b/>
-      <w:bCs/>
-      <w:color w:themeColor="accent1" w:val="4F81BD"/>
-      <w:sz w:val="28"/>
-      <w:szCs w:val="28"/>
+      <w:color w:themeColor="accent1" w:themeShade="BF" w:val="0F4761"/>
+      <w:sz w:val="32"/>
+      <w:szCs w:val="32"/>
     </w:rPr>
   </w:style>
   <w:style w:styleId="Heading3" w:type="paragraph">
-    <w:name w:val="Heading 3"/>
+    <w:name w:val="heading 3"/>
     <w:basedOn w:val="Normal"/>
     <w:next w:val="BodyText"/>
+    <w:link w:val="Heading3Char"/>
     <w:uiPriority w:val="9"/>
+    <w:semiHidden/>
     <w:unhideWhenUsed/>
     <w:qFormat/>
+    <w:rsid w:val="00A10FD9"/>
     <w:pPr>
       <w:keepNext/>
       <w:keepLines/>
-      <w:spacing w:after="0" w:before="200"/>
+      <w:spacing w:after="80" w:before="160"/>
       <w:outlineLvl w:val="2"/>
     </w:pPr>
     <w:rPr>
-      <w:rFonts w:asciiTheme="majorHAnsi" w:cstheme="majorBidi" w:eastAsiaTheme="majorEastAsia" w:hAnsiTheme="majorHAnsi"/>
-      <w:b/>
-      <w:bCs/>
-      <w:color w:themeColor="accent1" w:val="4F81BD"/>
-      <w:sz w:val="24"/>
-      <w:szCs w:val="24"/>
+      <w:rFonts w:cstheme="majorBidi" w:eastAsiaTheme="majorEastAsia"/>
+      <w:color w:themeColor="accent1" w:themeShade="BF" w:val="0F4761"/>
+      <w:sz w:val="28"/>
+      <w:szCs w:val="28"/>
     </w:rPr>
   </w:style>
   <w:style w:styleId="Heading4" w:type="paragraph">
-    <w:name w:val="Heading 4"/>
+    <w:name w:val="heading 4"/>
     <w:basedOn w:val="Normal"/>
     <w:next w:val="BodyText"/>
+    <w:link w:val="Heading4Char"/>
     <w:uiPriority w:val="9"/>
+    <w:semiHidden/>
     <w:unhideWhenUsed/>
     <w:qFormat/>
+    <w:rsid w:val="00A10FD9"/>
     <w:pPr>
       <w:keepNext/>
       <w:keepLines/>
-      <w:spacing w:after="0" w:before="200"/>
+      <w:spacing w:after="40" w:before="80"/>
       <w:outlineLvl w:val="3"/>
     </w:pPr>
     <w:rPr>
-      <w:rFonts w:asciiTheme="majorHAnsi" w:cstheme="majorBidi" w:eastAsiaTheme="majorEastAsia" w:hAnsiTheme="majorHAnsi"/>
+      <w:rFonts w:cstheme="majorBidi" w:eastAsiaTheme="majorEastAsia"/>
       <w:i/>
-      <w:bCs/>
-      <w:color w:themeColor="accent1" w:val="4F81BD"/>
-      <w:sz w:val="24"/>
-      <w:szCs w:val="24"/>
+      <w:iCs/>
+      <w:color w:themeColor="accent1" w:themeShade="BF" w:val="0F4761"/>
     </w:rPr>
   </w:style>
   <w:style w:styleId="Heading5" w:type="paragraph">
-    <w:name w:val="Heading 5"/>
+    <w:name w:val="heading 5"/>
     <w:basedOn w:val="Normal"/>
     <w:next w:val="BodyText"/>
+    <w:link w:val="Heading5Char"/>
     <w:uiPriority w:val="9"/>
+    <w:semiHidden/>
     <w:unhideWhenUsed/>
     <w:qFormat/>
+    <w:rsid w:val="00A10FD9"/>
     <w:pPr>
       <w:keepNext/>
       <w:keepLines/>
-      <w:spacing w:after="0" w:before="200"/>
+      <w:spacing w:after="40" w:before="80"/>
       <w:outlineLvl w:val="4"/>
     </w:pPr>
     <w:rPr>
-      <w:rFonts w:asciiTheme="majorHAnsi" w:cstheme="majorBidi" w:eastAsiaTheme="majorEastAsia" w:hAnsiTheme="majorHAnsi"/>
-      <w:iCs/>
-      <w:color w:themeColor="accent1" w:val="4F81BD"/>
-      <w:sz w:val="24"/>
-      <w:szCs w:val="24"/>
+      <w:rFonts w:cstheme="majorBidi" w:eastAsiaTheme="majorEastAsia"/>
+      <w:color w:themeColor="accent1" w:themeShade="BF" w:val="0F4761"/>
     </w:rPr>
   </w:style>
   <w:style w:styleId="Heading6" w:type="paragraph">
-    <w:name w:val="Heading 6"/>
+    <w:name w:val="heading 6"/>
     <w:basedOn w:val="Normal"/>
     <w:next w:val="BodyText"/>
+    <w:link w:val="Heading6Char"/>
     <w:uiPriority w:val="9"/>
+    <w:semiHidden/>
     <w:unhideWhenUsed/>
     <w:qFormat/>
+    <w:rsid w:val="00A10FD9"/>
     <w:pPr>
       <w:keepNext/>
       <w:keepLines/>
-      <w:spacing w:after="0" w:before="200"/>
+      <w:spacing w:after="0" w:before="40"/>
       <w:outlineLvl w:val="5"/>
     </w:pPr>
     <w:rPr>
-      <w:rFonts w:asciiTheme="majorHAnsi" w:cstheme="majorBidi" w:eastAsiaTheme="majorEastAsia" w:hAnsiTheme="majorHAnsi"/>
-      <w:color w:themeColor="accent1" w:val="4F81BD"/>
-      <w:sz w:val="24"/>
-      <w:szCs w:val="24"/>
+      <w:rFonts w:cstheme="majorBidi" w:eastAsiaTheme="majorEastAsia"/>
+      <w:i/>
+      <w:iCs/>
+      <w:color w:themeColor="text1" w:themeTint="A6" w:val="595959"/>
     </w:rPr>
   </w:style>
   <w:style w:styleId="Heading7" w:type="paragraph">
-    <w:name w:val="Heading 7"/>
+    <w:name w:val="heading 7"/>
     <w:basedOn w:val="Normal"/>
     <w:next w:val="BodyText"/>
+    <w:link w:val="Heading7Char"/>
     <w:uiPriority w:val="9"/>
+    <w:semiHidden/>
     <w:unhideWhenUsed/>
     <w:qFormat/>
+    <w:rsid w:val="00A10FD9"/>
     <w:pPr>
       <w:keepNext/>
       <w:keepLines/>
-      <w:spacing w:after="0" w:before="200"/>
+      <w:spacing w:after="0" w:before="40"/>
       <w:outlineLvl w:val="6"/>
     </w:pPr>
     <w:rPr>
-      <w:rFonts w:asciiTheme="majorHAnsi" w:cstheme="majorBidi" w:eastAsiaTheme="majorEastAsia" w:hAnsiTheme="majorHAnsi"/>
-      <w:color w:themeColor="accent1" w:val="4F81BD"/>
-      <w:sz w:val="24"/>
-      <w:szCs w:val="24"/>
+      <w:rFonts w:cstheme="majorBidi" w:eastAsiaTheme="majorEastAsia"/>
+      <w:color w:themeColor="text1" w:themeTint="A6" w:val="595959"/>
     </w:rPr>
   </w:style>
   <w:style w:styleId="Heading8" w:type="paragraph">
-    <w:name w:val="Heading 8"/>
+    <w:name w:val="heading 8"/>
     <w:basedOn w:val="Normal"/>
     <w:next w:val="BodyText"/>
+    <w:link w:val="Heading8Char"/>
     <w:uiPriority w:val="9"/>
+    <w:semiHidden/>
     <w:unhideWhenUsed/>
     <w:qFormat/>
+    <w:rsid w:val="00A10FD9"/>
     <w:pPr>
       <w:keepNext/>
       <w:keepLines/>
-      <w:spacing w:after="0" w:before="200"/>
+      <w:spacing w:after="0"/>
       <w:outlineLvl w:val="7"/>
     </w:pPr>
     <w:rPr>
-      <w:rFonts w:asciiTheme="majorHAnsi" w:cstheme="majorBidi" w:eastAsiaTheme="majorEastAsia" w:hAnsiTheme="majorHAnsi"/>
-      <w:color w:themeColor="accent1" w:val="4F81BD"/>
-      <w:sz w:val="24"/>
-      <w:szCs w:val="24"/>
+      <w:rFonts w:cstheme="majorBidi" w:eastAsiaTheme="majorEastAsia"/>
+      <w:i/>
+      <w:iCs/>
+      <w:color w:themeColor="text1" w:themeTint="D8" w:val="272727"/>
     </w:rPr>
   </w:style>
   <w:style w:styleId="Heading9" w:type="paragraph">
-    <w:name w:val="Heading 9"/>
+    <w:name w:val="heading 9"/>
     <w:basedOn w:val="Normal"/>
     <w:next w:val="BodyText"/>
+    <w:link w:val="Heading9Char"/>
     <w:uiPriority w:val="9"/>
+    <w:semiHidden/>
     <w:unhideWhenUsed/>
     <w:qFormat/>
+    <w:rsid w:val="00A10FD9"/>
     <w:pPr>
       <w:keepNext/>
       <w:keepLines/>
-      <w:spacing w:after="0" w:before="200"/>
+      <w:spacing w:after="0"/>
       <w:outlineLvl w:val="8"/>
     </w:pPr>
     <w:rPr>
+      <w:rFonts w:cstheme="majorBidi" w:eastAsiaTheme="majorEastAsia"/>
+      <w:color w:themeColor="text1" w:themeTint="D8" w:val="272727"/>
+    </w:rPr>
+  </w:style>
+  <w:style w:customStyle="1" w:styleId="Heading1Char" w:type="character">
+    <w:name w:val="Heading 1 Char"/>
+    <w:basedOn w:val="DefaultParagraphFont"/>
+    <w:link w:val="Heading1"/>
+    <w:uiPriority w:val="9"/>
+    <w:rsid w:val="00A10FD9"/>
+    <w:rPr>
       <w:rFonts w:asciiTheme="majorHAnsi" w:cstheme="majorBidi" w:eastAsiaTheme="majorEastAsia" w:hAnsiTheme="majorHAnsi"/>
-      <w:color w:themeColor="accent1" w:val="4F81BD"/>
-      <w:sz w:val="24"/>
-      <w:szCs w:val="24"/>
+      <w:color w:themeColor="accent1" w:themeShade="BF" w:val="0F4761"/>
+      <w:sz w:val="40"/>
+      <w:szCs w:val="40"/>
+    </w:rPr>
+  </w:style>
+  <w:style w:customStyle="1" w:styleId="Heading2Char" w:type="character">
+    <w:name w:val="Heading 2 Char"/>
+    <w:basedOn w:val="DefaultParagraphFont"/>
+    <w:link w:val="Heading2"/>
+    <w:uiPriority w:val="9"/>
+    <w:semiHidden/>
+    <w:rsid w:val="00A10FD9"/>
+    <w:rPr>
+      <w:rFonts w:asciiTheme="majorHAnsi" w:cstheme="majorBidi" w:eastAsiaTheme="majorEastAsia" w:hAnsiTheme="majorHAnsi"/>
+      <w:color w:themeColor="accent1" w:themeShade="BF" w:val="0F4761"/>
+      <w:sz w:val="32"/>
+      <w:szCs w:val="32"/>
+    </w:rPr>
+  </w:style>
+  <w:style w:customStyle="1" w:styleId="Heading3Char" w:type="character">
+    <w:name w:val="Heading 3 Char"/>
+    <w:basedOn w:val="DefaultParagraphFont"/>
+    <w:link w:val="Heading3"/>
+    <w:uiPriority w:val="9"/>
+    <w:semiHidden/>
+    <w:rsid w:val="00A10FD9"/>
+    <w:rPr>
+      <w:rFonts w:cstheme="majorBidi" w:eastAsiaTheme="majorEastAsia"/>
+      <w:color w:themeColor="accent1" w:themeShade="BF" w:val="0F4761"/>
+      <w:sz w:val="28"/>
+      <w:szCs w:val="28"/>
+    </w:rPr>
+  </w:style>
+  <w:style w:customStyle="1" w:styleId="Heading4Char" w:type="character">
+    <w:name w:val="Heading 4 Char"/>
+    <w:basedOn w:val="DefaultParagraphFont"/>
+    <w:link w:val="Heading4"/>
+    <w:uiPriority w:val="9"/>
+    <w:semiHidden/>
+    <w:rsid w:val="00A10FD9"/>
+    <w:rPr>
+      <w:rFonts w:cstheme="majorBidi" w:eastAsiaTheme="majorEastAsia"/>
+      <w:i/>
+      <w:iCs/>
+      <w:color w:themeColor="accent1" w:themeShade="BF" w:val="0F4761"/>
+    </w:rPr>
+  </w:style>
+  <w:style w:customStyle="1" w:styleId="Heading5Char" w:type="character">
+    <w:name w:val="Heading 5 Char"/>
+    <w:basedOn w:val="DefaultParagraphFont"/>
+    <w:link w:val="Heading5"/>
+    <w:uiPriority w:val="9"/>
+    <w:semiHidden/>
+    <w:rsid w:val="00A10FD9"/>
+    <w:rPr>
+      <w:rFonts w:cstheme="majorBidi" w:eastAsiaTheme="majorEastAsia"/>
+      <w:color w:themeColor="accent1" w:themeShade="BF" w:val="0F4761"/>
+    </w:rPr>
+  </w:style>
+  <w:style w:customStyle="1" w:styleId="Heading6Char" w:type="character">
+    <w:name w:val="Heading 6 Char"/>
+    <w:basedOn w:val="DefaultParagraphFont"/>
+    <w:link w:val="Heading6"/>
+    <w:uiPriority w:val="9"/>
+    <w:semiHidden/>
+    <w:rsid w:val="00A10FD9"/>
+    <w:rPr>
+      <w:rFonts w:cstheme="majorBidi" w:eastAsiaTheme="majorEastAsia"/>
+      <w:i/>
+      <w:iCs/>
+      <w:color w:themeColor="text1" w:themeTint="A6" w:val="595959"/>
+    </w:rPr>
+  </w:style>
+  <w:style w:customStyle="1" w:styleId="Heading7Char" w:type="character">
+    <w:name w:val="Heading 7 Char"/>
+    <w:basedOn w:val="DefaultParagraphFont"/>
+    <w:link w:val="Heading7"/>
+    <w:uiPriority w:val="9"/>
+    <w:semiHidden/>
+    <w:rsid w:val="00A10FD9"/>
+    <w:rPr>
+      <w:rFonts w:cstheme="majorBidi" w:eastAsiaTheme="majorEastAsia"/>
+      <w:color w:themeColor="text1" w:themeTint="A6" w:val="595959"/>
+    </w:rPr>
+  </w:style>
+  <w:style w:customStyle="1" w:styleId="Heading8Char" w:type="character">
+    <w:name w:val="Heading 8 Char"/>
+    <w:basedOn w:val="DefaultParagraphFont"/>
+    <w:link w:val="Heading8"/>
+    <w:uiPriority w:val="9"/>
+    <w:semiHidden/>
+    <w:rsid w:val="00A10FD9"/>
+    <w:rPr>
+      <w:rFonts w:cstheme="majorBidi" w:eastAsiaTheme="majorEastAsia"/>
+      <w:i/>
+      <w:iCs/>
+      <w:color w:themeColor="text1" w:themeTint="D8" w:val="272727"/>
+    </w:rPr>
+  </w:style>
+  <w:style w:customStyle="1" w:styleId="Heading9Char" w:type="character">
+    <w:name w:val="Heading 9 Char"/>
+    <w:basedOn w:val="DefaultParagraphFont"/>
+    <w:link w:val="Heading9"/>
+    <w:uiPriority w:val="9"/>
+    <w:semiHidden/>
+    <w:rsid w:val="00A10FD9"/>
+    <w:rPr>
+      <w:rFonts w:cstheme="majorBidi" w:eastAsiaTheme="majorEastAsia"/>
+      <w:color w:themeColor="text1" w:themeTint="D8" w:val="272727"/>
     </w:rPr>
   </w:style>
   <w:style w:styleId="BlockText" w:type="paragraph">
@@ -2133,6 +2043,18 @@
     <w:uiPriority w:val="9"/>
     <w:unhideWhenUsed/>
     <w:qFormat/>
+  </w:style>
+  <w:style w:styleId="FootnoteBlockText" w:type="paragraph">
+    <w:name w:val="Footnote Block Text"/>
+    <w:basedOn w:val="FootnoteText"/>
+    <w:next w:val="FootnoteText"/>
+    <w:uiPriority w:val="9"/>
+    <w:unhideWhenUsed/>
+    <w:qFormat/>
+    <w:pPr>
+      <w:spacing w:after="100" w:before="100"/>
+      <w:ind w:firstLine="0" w:left="480" w:right="480"/>
+    </w:pPr>
   </w:style>
   <w:style w:default="1" w:styleId="DefaultParagraphFont" w:type="character">
     <w:name w:val="Default Paragraph Font"/>
@@ -2155,18 +2077,11 @@
       </w:tblCellMar>
     </w:tblPr>
     <w:tblStylePr w:type="firstRow">
-      <w:tblPr>
-        <w:jc w:val="left"/>
-        <w:tblInd w:type="dxa" w:w="0"/>
-      </w:tblPr>
-      <w:trPr>
-        <w:jc w:val="left"/>
-      </w:trPr>
       <w:tcPr>
-        <w:vAlign w:val="bottom"/>
         <w:tcBorders>
           <w:bottom w:val="single"/>
         </w:tcBorders>
+        <w:vAlign w:val="bottom"/>
       </w:tcPr>
     </w:tblStylePr>
   </w:style>
@@ -2281,8 +2196,8 @@
     <w:name w:val="KeywordTok"/>
     <w:basedOn w:val="VerbatimChar"/>
     <w:rPr>
+      <w:b/>
       <w:color w:val="007020"/>
-      <w:b/>
     </w:rPr>
   </w:style>
   <w:style w:type="character" w:customStyle="1" w:styleId="DataTypeTok">
@@ -2359,42 +2274,42 @@
     <w:name w:val="ImportTok"/>
     <w:basedOn w:val="VerbatimChar"/>
     <w:rPr>
+      <w:b/>
       <w:color w:val="008000"/>
-      <w:b/>
     </w:rPr>
   </w:style>
   <w:style w:type="character" w:customStyle="1" w:styleId="CommentTok">
     <w:name w:val="CommentTok"/>
     <w:basedOn w:val="VerbatimChar"/>
     <w:rPr>
+      <w:i/>
       <w:color w:val="60a0b0"/>
-      <w:i/>
     </w:rPr>
   </w:style>
   <w:style w:type="character" w:customStyle="1" w:styleId="DocumentationTok">
     <w:name w:val="DocumentationTok"/>
     <w:basedOn w:val="VerbatimChar"/>
     <w:rPr>
+      <w:i/>
       <w:color w:val="ba2121"/>
-      <w:i/>
     </w:rPr>
   </w:style>
   <w:style w:type="character" w:customStyle="1" w:styleId="AnnotationTok">
     <w:name w:val="AnnotationTok"/>
     <w:basedOn w:val="VerbatimChar"/>
     <w:rPr>
-      <w:color w:val="60a0b0"/>
       <w:b/>
       <w:i/>
+      <w:color w:val="60a0b0"/>
     </w:rPr>
   </w:style>
   <w:style w:type="character" w:customStyle="1" w:styleId="CommentVarTok">
     <w:name w:val="CommentVarTok"/>
     <w:basedOn w:val="VerbatimChar"/>
     <w:rPr>
-      <w:color w:val="60a0b0"/>
       <w:b/>
       <w:i/>
+      <w:color w:val="60a0b0"/>
     </w:rPr>
   </w:style>
   <w:style w:type="character" w:customStyle="1" w:styleId="OtherTok">
@@ -2422,8 +2337,8 @@
     <w:name w:val="ControlFlowTok"/>
     <w:basedOn w:val="VerbatimChar"/>
     <w:rPr>
+      <w:b/>
       <w:color w:val="007020"/>
-      <w:b/>
     </w:rPr>
   </w:style>
   <w:style w:type="character" w:customStyle="1" w:styleId="OperatorTok">
@@ -2468,34 +2383,34 @@
     <w:name w:val="InformationTok"/>
     <w:basedOn w:val="VerbatimChar"/>
     <w:rPr>
-      <w:color w:val="60a0b0"/>
       <w:b/>
       <w:i/>
+      <w:color w:val="60a0b0"/>
     </w:rPr>
   </w:style>
   <w:style w:type="character" w:customStyle="1" w:styleId="WarningTok">
     <w:name w:val="WarningTok"/>
     <w:basedOn w:val="VerbatimChar"/>
     <w:rPr>
-      <w:color w:val="60a0b0"/>
       <w:b/>
       <w:i/>
+      <w:color w:val="60a0b0"/>
     </w:rPr>
   </w:style>
   <w:style w:type="character" w:customStyle="1" w:styleId="AlertTok">
     <w:name w:val="AlertTok"/>
     <w:basedOn w:val="VerbatimChar"/>
     <w:rPr>
+      <w:b/>
       <w:color w:val="ff0000"/>
-      <w:b/>
     </w:rPr>
   </w:style>
   <w:style w:type="character" w:customStyle="1" w:styleId="ErrorTok">
     <w:name w:val="ErrorTok"/>
     <w:basedOn w:val="VerbatimChar"/>
     <w:rPr>
+      <w:b/>
       <w:color w:val="ff0000"/>
-      <w:b/>
     </w:rPr>
   </w:style>
   <w:style w:type="character" w:customStyle="1" w:styleId="NormalTok">
@@ -2517,44 +2432,44 @@
         <a:sysClr val="window" lastClr="FFFFFF"/>
       </a:lt1>
       <a:dk2>
-        <a:srgbClr val="1F497D"/>
+        <a:srgbClr val="0E2841"/>
       </a:dk2>
       <a:lt2>
-        <a:srgbClr val="EEECE1"/>
+        <a:srgbClr val="E8E8E8"/>
       </a:lt2>
       <a:accent1>
-        <a:srgbClr val="4F81BD"/>
+        <a:srgbClr val="156082"/>
       </a:accent1>
       <a:accent2>
-        <a:srgbClr val="C0504D"/>
+        <a:srgbClr val="E97132"/>
       </a:accent2>
       <a:accent3>
-        <a:srgbClr val="9BBB59"/>
+        <a:srgbClr val="196B24"/>
       </a:accent3>
       <a:accent4>
-        <a:srgbClr val="8064A2"/>
+        <a:srgbClr val="0F9ED5"/>
       </a:accent4>
       <a:accent5>
-        <a:srgbClr val="4BACC6"/>
+        <a:srgbClr val="A02B93"/>
       </a:accent5>
       <a:accent6>
-        <a:srgbClr val="F79646"/>
+        <a:srgbClr val="4EA72E"/>
       </a:accent6>
       <a:hlink>
-        <a:srgbClr val="0000FF"/>
+        <a:srgbClr val="467886"/>
       </a:hlink>
       <a:folHlink>
-        <a:srgbClr val="800080"/>
+        <a:srgbClr val="96607D"/>
       </a:folHlink>
     </a:clrScheme>
     <a:fontScheme name="Office">
       <a:majorFont>
-        <a:latin typeface="Calibri"/>
+        <a:latin typeface="Aptos Display" panose="02110004020202020204"/>
         <a:ea typeface=""/>
         <a:cs typeface=""/>
-        <a:font script="Jpan" typeface="ＭＳ ゴシック"/>
+        <a:font script="Jpan" typeface="游ゴシック Light"/>
         <a:font script="Hang" typeface="맑은 고딕"/>
-        <a:font script="Hans" typeface="宋体"/>
+        <a:font script="Hans" typeface="等线 Light"/>
         <a:font script="Hant" typeface="新細明體"/>
         <a:font script="Arab" typeface="Times New Roman"/>
         <a:font script="Hebr" typeface="Times New Roman"/>
@@ -2581,14 +2496,32 @@
         <a:font script="Mong" typeface="Mongolian Baiti"/>
         <a:font script="Viet" typeface="Times New Roman"/>
         <a:font script="Uigh" typeface="Microsoft Uighur"/>
+        <a:font script="Geor" typeface="Sylfaen"/>
+        <a:font script="Armn" typeface="Arial"/>
+        <a:font script="Bugi" typeface="Leelawadee UI"/>
+        <a:font script="Bopo" typeface="Microsoft JhengHei"/>
+        <a:font script="Java" typeface="Javanese Text"/>
+        <a:font script="Lisu" typeface="Segoe UI"/>
+        <a:font script="Mymr" typeface="Myanmar Text"/>
+        <a:font script="Nkoo" typeface="Ebrima"/>
+        <a:font script="Olck" typeface="Nirmala UI"/>
+        <a:font script="Osma" typeface="Ebrima"/>
+        <a:font script="Phag" typeface="Phagspa"/>
+        <a:font script="Syrn" typeface="Estrangelo Edessa"/>
+        <a:font script="Syrj" typeface="Estrangelo Edessa"/>
+        <a:font script="Syre" typeface="Estrangelo Edessa"/>
+        <a:font script="Sora" typeface="Nirmala UI"/>
+        <a:font script="Tale" typeface="Microsoft Tai Le"/>
+        <a:font script="Talu" typeface="Microsoft New Tai Lue"/>
+        <a:font script="Tfng" typeface="Ebrima"/>
       </a:majorFont>
       <a:minorFont>
-        <a:latin typeface="Cambria"/>
+        <a:latin typeface="Aptos" panose="02110004020202020204"/>
         <a:ea typeface=""/>
         <a:cs typeface=""/>
-        <a:font script="Jpan" typeface="ＭＳ 明朝"/>
+        <a:font script="Jpan" typeface="游明朝"/>
         <a:font script="Hang" typeface="맑은 고딕"/>
-        <a:font script="Hans" typeface="宋体"/>
+        <a:font script="Hans" typeface="等线"/>
         <a:font script="Hant" typeface="新細明體"/>
         <a:font script="Arab" typeface="Arial"/>
         <a:font script="Hebr" typeface="Arial"/>
@@ -2615,6 +2548,24 @@
         <a:font script="Mong" typeface="Mongolian Baiti"/>
         <a:font script="Viet" typeface="Arial"/>
         <a:font script="Uigh" typeface="Microsoft Uighur"/>
+        <a:font script="Geor" typeface="Sylfaen"/>
+        <a:font script="Armn" typeface="Arial"/>
+        <a:font script="Bugi" typeface="Leelawadee UI"/>
+        <a:font script="Bopo" typeface="Microsoft JhengHei"/>
+        <a:font script="Java" typeface="Javanese Text"/>
+        <a:font script="Lisu" typeface="Segoe UI"/>
+        <a:font script="Mymr" typeface="Myanmar Text"/>
+        <a:font script="Nkoo" typeface="Ebrima"/>
+        <a:font script="Olck" typeface="Nirmala UI"/>
+        <a:font script="Osma" typeface="Ebrima"/>
+        <a:font script="Phag" typeface="Phagspa"/>
+        <a:font script="Syrn" typeface="Estrangelo Edessa"/>
+        <a:font script="Syrj" typeface="Estrangelo Edessa"/>
+        <a:font script="Syre" typeface="Estrangelo Edessa"/>
+        <a:font script="Sora" typeface="Nirmala UI"/>
+        <a:font script="Tale" typeface="Microsoft Tai Le"/>
+        <a:font script="Talu" typeface="Microsoft New Tai Lue"/>
+        <a:font script="Tfng" typeface="Ebrima"/>
       </a:minorFont>
     </a:fontScheme>
     <a:fmtScheme name="Office">
@@ -2626,200 +2577,141 @@
           <a:gsLst>
             <a:gs pos="0">
               <a:schemeClr val="phClr">
-                <a:tint val="50000"/>
-                <a:satMod val="300000"/>
+                <a:lumMod val="110000"/>
+                <a:satMod val="105000"/>
+                <a:tint val="67000"/>
               </a:schemeClr>
             </a:gs>
-            <a:gs pos="35000">
+            <a:gs pos="50000">
               <a:schemeClr val="phClr">
-                <a:tint val="37000"/>
-                <a:satMod val="300000"/>
+                <a:lumMod val="105000"/>
+                <a:satMod val="103000"/>
+                <a:tint val="73000"/>
               </a:schemeClr>
             </a:gs>
             <a:gs pos="100000">
               <a:schemeClr val="phClr">
-                <a:tint val="15000"/>
-                <a:satMod val="350000"/>
+                <a:lumMod val="105000"/>
+                <a:satMod val="109000"/>
+                <a:tint val="81000"/>
               </a:schemeClr>
             </a:gs>
           </a:gsLst>
-          <a:lin ang="16200000" scaled="1"/>
+          <a:lin ang="5400000" scaled="0"/>
         </a:gradFill>
         <a:gradFill rotWithShape="1">
           <a:gsLst>
             <a:gs pos="0">
               <a:schemeClr val="phClr">
-                <a:tint val="100000"/>
+                <a:satMod val="103000"/>
+                <a:lumMod val="102000"/>
+                <a:tint val="94000"/>
+              </a:schemeClr>
+            </a:gs>
+            <a:gs pos="50000">
+              <a:schemeClr val="phClr">
+                <a:satMod val="110000"/>
+                <a:lumMod val="100000"/>
                 <a:shade val="100000"/>
-                <a:satMod val="130000"/>
               </a:schemeClr>
             </a:gs>
             <a:gs pos="100000">
               <a:schemeClr val="phClr">
-                <a:tint val="50000"/>
-                <a:shade val="100000"/>
-                <a:satMod val="350000"/>
+                <a:lumMod val="99000"/>
+                <a:satMod val="120000"/>
+                <a:shade val="78000"/>
               </a:schemeClr>
             </a:gs>
           </a:gsLst>
-          <a:lin ang="16200000" scaled="0"/>
+          <a:lin ang="5400000" scaled="0"/>
         </a:gradFill>
       </a:fillStyleLst>
       <a:lnStyleLst>
-        <a:ln w="9525" cap="flat" cmpd="sng" algn="ctr">
-          <a:solidFill>
-            <a:schemeClr val="phClr">
-              <a:shade val="95000"/>
-              <a:satMod val="105000"/>
-            </a:schemeClr>
-          </a:solidFill>
-          <a:prstDash val="solid"/>
-        </a:ln>
-        <a:ln w="25400" cap="flat" cmpd="sng" algn="ctr">
+        <a:ln w="6350" cap="flat" cmpd="sng" algn="ctr">
           <a:solidFill>
             <a:schemeClr val="phClr"/>
           </a:solidFill>
           <a:prstDash val="solid"/>
+          <a:miter lim="800000"/>
         </a:ln>
-        <a:ln w="38100" cap="flat" cmpd="sng" algn="ctr">
+        <a:ln w="12700" cap="flat" cmpd="sng" algn="ctr">
           <a:solidFill>
             <a:schemeClr val="phClr"/>
           </a:solidFill>
           <a:prstDash val="solid"/>
+          <a:miter lim="800000"/>
+        </a:ln>
+        <a:ln w="19050" cap="flat" cmpd="sng" algn="ctr">
+          <a:solidFill>
+            <a:schemeClr val="phClr"/>
+          </a:solidFill>
+          <a:prstDash val="solid"/>
+          <a:miter lim="800000"/>
         </a:ln>
       </a:lnStyleLst>
       <a:effectStyleLst>
         <a:effectStyle>
+          <a:effectLst/>
+        </a:effectStyle>
+        <a:effectStyle>
+          <a:effectLst/>
+        </a:effectStyle>
+        <a:effectStyle>
           <a:effectLst>
-            <a:outerShdw blurRad="40000" dist="20000" dir="5400000" rotWithShape="0">
+            <a:outerShdw blurRad="57150" dist="19050" dir="5400000" algn="ctr" rotWithShape="0">
               <a:srgbClr val="000000">
-                <a:alpha val="38000"/>
+                <a:alpha val="63000"/>
               </a:srgbClr>
             </a:outerShdw>
           </a:effectLst>
-        </a:effectStyle>
-        <a:effectStyle>
-          <a:effectLst>
-            <a:outerShdw blurRad="40000" dist="23000" dir="5400000" rotWithShape="0">
-              <a:srgbClr val="000000">
-                <a:alpha val="35000"/>
-              </a:srgbClr>
-            </a:outerShdw>
-          </a:effectLst>
-        </a:effectStyle>
-        <a:effectStyle>
-          <a:effectLst>
-            <a:outerShdw blurRad="40000" dist="23000" dir="5400000" rotWithShape="0">
-              <a:srgbClr val="000000">
-                <a:alpha val="35000"/>
-              </a:srgbClr>
-            </a:outerShdw>
-          </a:effectLst>
-          <a:scene3d>
-            <a:camera prst="orthographicFront">
-              <a:rot lat="0" lon="0" rev="0"/>
-            </a:camera>
-            <a:lightRig rig="threePt" dir="t">
-              <a:rot lat="0" lon="0" rev="1200000"/>
-            </a:lightRig>
-          </a:scene3d>
-          <a:sp3d>
-            <a:bevelT w="63500" h="25400"/>
-          </a:sp3d>
         </a:effectStyle>
       </a:effectStyleLst>
       <a:bgFillStyleLst>
         <a:solidFill>
           <a:schemeClr val="phClr"/>
         </a:solidFill>
+        <a:solidFill>
+          <a:schemeClr val="phClr">
+            <a:tint val="95000"/>
+            <a:satMod val="170000"/>
+          </a:schemeClr>
+        </a:solidFill>
         <a:gradFill rotWithShape="1">
           <a:gsLst>
             <a:gs pos="0">
               <a:schemeClr val="phClr">
-                <a:tint val="40000"/>
-                <a:satMod val="350000"/>
+                <a:tint val="93000"/>
+                <a:satMod val="150000"/>
+                <a:shade val="98000"/>
+                <a:lumMod val="102000"/>
               </a:schemeClr>
             </a:gs>
-            <a:gs pos="40000">
+            <a:gs pos="50000">
               <a:schemeClr val="phClr">
-                <a:tint val="45000"/>
-                <a:shade val="99000"/>
-                <a:satMod val="350000"/>
+                <a:tint val="98000"/>
+                <a:satMod val="130000"/>
+                <a:shade val="90000"/>
+                <a:lumMod val="103000"/>
               </a:schemeClr>
             </a:gs>
             <a:gs pos="100000">
               <a:schemeClr val="phClr">
-                <a:shade val="20000"/>
-                <a:satMod val="255000"/>
+                <a:shade val="63000"/>
+                <a:satMod val="120000"/>
               </a:schemeClr>
             </a:gs>
           </a:gsLst>
-          <a:path path="circle">
-            <a:fillToRect l="50000" t="-80000" r="50000" b="180000"/>
-          </a:path>
-        </a:gradFill>
-        <a:gradFill rotWithShape="1">
-          <a:gsLst>
-            <a:gs pos="0">
-              <a:schemeClr val="phClr">
-                <a:tint val="80000"/>
-                <a:satMod val="300000"/>
-              </a:schemeClr>
-            </a:gs>
-            <a:gs pos="100000">
-              <a:schemeClr val="phClr">
-                <a:shade val="30000"/>
-                <a:satMod val="200000"/>
-              </a:schemeClr>
-            </a:gs>
-          </a:gsLst>
-          <a:path path="circle">
-            <a:fillToRect l="50000" t="50000" r="50000" b="50000"/>
-          </a:path>
+          <a:lin ang="5400000" scaled="0"/>
         </a:gradFill>
       </a:bgFillStyleLst>
     </a:fmtScheme>
   </a:themeElements>
-  <a:objectDefaults>
-    <a:spDef>
-      <a:spPr/>
-      <a:bodyPr/>
-      <a:lstStyle/>
-      <a:style>
-        <a:lnRef idx="1">
-          <a:schemeClr val="accent1"/>
-        </a:lnRef>
-        <a:fillRef idx="3">
-          <a:schemeClr val="accent1"/>
-        </a:fillRef>
-        <a:effectRef idx="2">
-          <a:schemeClr val="accent1"/>
-        </a:effectRef>
-        <a:fontRef idx="minor">
-          <a:schemeClr val="lt1"/>
-        </a:fontRef>
-      </a:style>
-    </a:spDef>
-    <a:lnDef>
-      <a:spPr/>
-      <a:bodyPr/>
-      <a:lstStyle/>
-      <a:style>
-        <a:lnRef idx="2">
-          <a:schemeClr val="accent1"/>
-        </a:lnRef>
-        <a:fillRef idx="0">
-          <a:schemeClr val="accent1"/>
-        </a:fillRef>
-        <a:effectRef idx="1">
-          <a:schemeClr val="accent1"/>
-        </a:effectRef>
-        <a:fontRef idx="minor">
-          <a:schemeClr val="tx1"/>
-        </a:fontRef>
-      </a:style>
-    </a:lnDef>
-  </a:objectDefaults>
+  <a:objectDefaults/>
   <a:extraClrSchemeLst/>
+  <a:extLst>
+    <a:ext uri="{05A4C25C-085E-4340-85A3-A5531E510DB2}">
+      <thm15:themeFamily xmlns:thm15="http://schemas.microsoft.com/office/thememl/2012/main" name="Office Theme" id="{2E142A2C-CD16-42D6-873A-C26D2A0506FA}" vid="{1BDDFF52-6CD6-40A5-AB3C-68EB2F1E4D0A}"/>
+    </a:ext>
+  </a:extLst>
 </a:theme>
 </file>
</xml_diff>

<commit_message>
chore: render quarto artifacts
</commit_message>
<xml_diff>
--- a/article/article.docx
+++ b/article/article.docx
@@ -22,34 +22,24 @@
       <w:pPr>
         <w:pStyle w:val="Author"/>
       </w:pPr>
-      <w:hyperlink r:id="rId9">
-        <w:r>
-          <w:rPr>
-            <w:rStyle w:val="Hyperlink"/>
-          </w:rPr>
-          <w:t xml:space="preserve">Eleanor Roosevelt</w:t>
-        </w:r>
-      </w:hyperlink>
+      <w:r>
+        <w:t xml:space="preserve">Eleanor Roosevelt</w:t>
+      </w:r>
     </w:p>
     <w:p>
       <w:pPr>
         <w:pStyle w:val="Author"/>
       </w:pPr>
-      <w:hyperlink r:id="rId10">
-        <w:r>
-          <w:rPr>
-            <w:rStyle w:val="Hyperlink"/>
-          </w:rPr>
-          <w:t xml:space="preserve">John Peters Humphrey</w:t>
-        </w:r>
-      </w:hyperlink>
+      <w:r>
+        <w:t xml:space="preserve">John Peters Humphrey</w:t>
+      </w:r>
     </w:p>
     <w:p>
       <w:pPr>
         <w:pStyle w:val="Date"/>
       </w:pPr>
       <w:r>
-        <w:t xml:space="preserve">1 January 2023</w:t>
+        <w:t xml:space="preserve">2023-01-01</w:t>
       </w:r>
     </w:p>
     <w:p>
@@ -87,66 +77,14 @@
         <w:p>
           <w:r>
             <w:fldChar w:fldCharType="begin" w:dirty="true"/>
-            <w:instrText xml:space="preserve">TOC \o "1-3" \h \z \u</w:instrText>
+            <w:instrText xml:space="preserve">TOC \o "1-2" \h \z \u</w:instrText>
             <w:fldChar w:fldCharType="separate"/>
             <w:fldChar w:fldCharType="end"/>
           </w:r>
         </w:p>
       </w:sdtContent>
     </w:sdt>
-    <w:sdt>
-      <w:sdtPr>
-        <w:docPartObj>
-          <w:docPartGallery w:val="List of Figures"/>
-          <w:docPartUnique/>
-        </w:docPartObj>
-      </w:sdtPr>
-      <w:sdtContent>
-        <w:p>
-          <w:pPr>
-            <w:pStyle w:val="TOCHeading"/>
-          </w:pPr>
-          <w:r>
-            <w:t xml:space="preserve">List of Figures</w:t>
-          </w:r>
-        </w:p>
-        <w:p>
-          <w:r>
-            <w:fldChar w:fldCharType="begin" w:dirty="true"/>
-            <w:instrText xml:space="preserve">TOC \h \z \t "Image Caption" \c</w:instrText>
-            <w:fldChar w:fldCharType="separate"/>
-            <w:fldChar w:fldCharType="end"/>
-          </w:r>
-        </w:p>
-      </w:sdtContent>
-    </w:sdt>
-    <w:sdt>
-      <w:sdtPr>
-        <w:docPartObj>
-          <w:docPartGallery w:val="List of Tables"/>
-          <w:docPartUnique/>
-        </w:docPartObj>
-      </w:sdtPr>
-      <w:sdtContent>
-        <w:p>
-          <w:pPr>
-            <w:pStyle w:val="TOCHeading"/>
-          </w:pPr>
-          <w:r>
-            <w:t xml:space="preserve">List of Tables</w:t>
-          </w:r>
-        </w:p>
-        <w:p>
-          <w:r>
-            <w:fldChar w:fldCharType="begin" w:dirty="true"/>
-            <w:instrText xml:space="preserve">TOC \h \z \t "Table Caption" \c</w:instrText>
-            <w:fldChar w:fldCharType="separate"/>
-            <w:fldChar w:fldCharType="end"/>
-          </w:r>
-        </w:p>
-      </w:sdtContent>
-    </w:sdt>
-    <w:bookmarkStart w:id="37" w:name="heading-1"/>
+    <w:bookmarkStart w:id="35" w:name="heading-1"/>
     <w:p>
       <w:pPr>
         <w:pStyle w:val="Heading1"/>
@@ -163,7 +101,7 @@
         <w:t xml:space="preserve">All human beings are born free and equal in dignity and rights. All human beings are born free and equal in dignity and rights. All human beings are born free and equal in dignity and rights. All human beings are born free and equal in dignity and rights.</w:t>
       </w:r>
     </w:p>
-    <w:bookmarkStart w:id="13" w:name="heading-2"/>
+    <w:bookmarkStart w:id="11" w:name="heading-2"/>
     <w:p>
       <w:pPr>
         <w:pStyle w:val="Heading2"/>
@@ -180,7 +118,7 @@
         <w:t xml:space="preserve">All human beings are born free and equal in dignity and rights. All human beings are born free and equal in dignity and rights. All human beings are born free and equal in dignity and rights. All human beings are born free and equal in dignity and rights.</w:t>
       </w:r>
     </w:p>
-    <w:bookmarkStart w:id="12" w:name="heading-3"/>
+    <w:bookmarkStart w:id="10" w:name="heading-3"/>
     <w:p>
       <w:pPr>
         <w:pStyle w:val="Heading3"/>
@@ -197,7 +135,7 @@
         <w:t xml:space="preserve">All human beings are born free and equal in dignity and rights. All human beings are born free and equal in dignity and rights. All human beings are born free and equal in dignity and rights. All human beings are born free and equal in dignity and rights.</w:t>
       </w:r>
     </w:p>
-    <w:bookmarkStart w:id="11" w:name="heading-4"/>
+    <w:bookmarkStart w:id="9" w:name="heading-4"/>
     <w:p>
       <w:pPr>
         <w:pStyle w:val="Heading4"/>
@@ -214,10 +152,10 @@
         <w:t xml:space="preserve">All human beings are born free and equal in dignity and rights. All human beings are born free and equal in dignity and rights. All human beings are born free and equal in dignity and rights. All human beings are born free and equal in dignity and rights.</w:t>
       </w:r>
     </w:p>
+    <w:bookmarkEnd w:id="9"/>
+    <w:bookmarkEnd w:id="10"/>
     <w:bookmarkEnd w:id="11"/>
-    <w:bookmarkEnd w:id="12"/>
-    <w:bookmarkEnd w:id="13"/>
-    <w:bookmarkStart w:id="14" w:name="bold"/>
+    <w:bookmarkStart w:id="12" w:name="bold"/>
     <w:p>
       <w:pPr>
         <w:pStyle w:val="Heading2"/>
@@ -244,8 +182,8 @@
         <w:t xml:space="preserve">All human beings are born free and equal in dignity and rights.All human beings are born free and equal in dignity and rights.All human beings are born free and equal in dignity and rights.</w:t>
       </w:r>
     </w:p>
-    <w:bookmarkEnd w:id="14"/>
-    <w:bookmarkStart w:id="15" w:name="italic"/>
+    <w:bookmarkEnd w:id="12"/>
+    <w:bookmarkStart w:id="13" w:name="italic"/>
     <w:p>
       <w:pPr>
         <w:pStyle w:val="Heading2"/>
@@ -272,8 +210,8 @@
         <w:t xml:space="preserve">All human beings are born free and equal in dignity and rights.All human beings are born free and equal in dignity and rights.All human beings are born free and equal in dignity and rights.</w:t>
       </w:r>
     </w:p>
-    <w:bookmarkEnd w:id="15"/>
-    <w:bookmarkStart w:id="16" w:name="bold-and-italic"/>
+    <w:bookmarkEnd w:id="13"/>
+    <w:bookmarkStart w:id="14" w:name="bold-and-italic"/>
     <w:p>
       <w:pPr>
         <w:pStyle w:val="Heading2"/>
@@ -302,8 +240,8 @@
         <w:t xml:space="preserve">All human beings are born free and equal in dignity and rights.All human beings are born free and equal in dignity and rights.All human beings are born free and equal in dignity and rights.</w:t>
       </w:r>
     </w:p>
-    <w:bookmarkEnd w:id="16"/>
-    <w:bookmarkStart w:id="17" w:name="struck-through"/>
+    <w:bookmarkEnd w:id="14"/>
+    <w:bookmarkStart w:id="15" w:name="struck-through"/>
     <w:p>
       <w:pPr>
         <w:pStyle w:val="Heading2"/>
@@ -329,8 +267,8 @@
         <w:t xml:space="preserve">All human beings are born free and equal in dignity and rights.All human beings are born free and equal in dignity and rights.All human beings are born free and equal in dignity and rights.</w:t>
       </w:r>
     </w:p>
-    <w:bookmarkEnd w:id="17"/>
-    <w:bookmarkStart w:id="18" w:name="numbered-lists"/>
+    <w:bookmarkEnd w:id="15"/>
+    <w:bookmarkStart w:id="16" w:name="numbered-lists"/>
     <w:p>
       <w:pPr>
         <w:pStyle w:val="Heading2"/>
@@ -395,8 +333,8 @@
         <w:t xml:space="preserve">All human beings are born free and equal in dignity and rights. All human beings are born free and equal in dignity and rights. All human beings are born free and equal in dignity and rights. All human beings are born free and equal in dignity and rights.</w:t>
       </w:r>
     </w:p>
-    <w:bookmarkEnd w:id="18"/>
-    <w:bookmarkStart w:id="19" w:name="unnumbered-lists"/>
+    <w:bookmarkEnd w:id="16"/>
+    <w:bookmarkStart w:id="17" w:name="unnumbered-lists"/>
     <w:p>
       <w:pPr>
         <w:pStyle w:val="Heading2"/>
@@ -449,8 +387,8 @@
         <w:t xml:space="preserve">All human beings are born free and equal in dignity and rights. All human beings are born free and equal in dignity and rights. All human beings are born free and equal in dignity and rights. All human beings are born free and equal in dignity and rights.</w:t>
       </w:r>
     </w:p>
-    <w:bookmarkEnd w:id="19"/>
-    <w:bookmarkStart w:id="20" w:name="mixed-lists"/>
+    <w:bookmarkEnd w:id="17"/>
+    <w:bookmarkStart w:id="18" w:name="mixed-lists"/>
     <w:p>
       <w:pPr>
         <w:pStyle w:val="Heading2"/>
@@ -515,8 +453,8 @@
         <w:t xml:space="preserve">All human beings are born free and equal in dignity and rights. All human beings are born free and equal in dignity and rights. All human beings are born free and equal in dignity and rights. All human beings are born free and equal in dignity and rights.</w:t>
       </w:r>
     </w:p>
-    <w:bookmarkEnd w:id="20"/>
-    <w:bookmarkStart w:id="25" w:name="figures-and-captions"/>
+    <w:bookmarkEnd w:id="18"/>
+    <w:bookmarkStart w:id="23" w:name="figures-and-captions"/>
     <w:p>
       <w:pPr>
         <w:pStyle w:val="Heading2"/>
@@ -534,18 +472,18 @@
           <wp:inline>
             <wp:extent cx="5334000" cy="4030133"/>
             <wp:effectExtent b="0" l="0" r="0" t="0"/>
-            <wp:docPr descr="Eleanor Roosevelt hält die englische Version der Allgemeinen Erklärung der Menschenrechte (FDR Presidential Library &amp; Museum, CC BY 2.0 https://creativecommons.org/licenses/by/2.0, via Wikimedia Commons)" title="" id="22" name="Picture"/>
+            <wp:docPr descr="Eleanor Roosevelt hält die englische Version der Allgemeinen Erklärung der Menschenrechte (FDR Presidential Library &amp; Museum, CC BY 2.0 https://creativecommons.org/licenses/by/2.0, via Wikimedia Commons)" title="" id="20" name="Picture"/>
             <a:graphic>
               <a:graphicData uri="http://schemas.openxmlformats.org/drawingml/2006/picture">
                 <pic:pic>
                   <pic:nvPicPr>
-                    <pic:cNvPr descr="images/Eleanor_Roosevelt_and_Human_Rights_Declaration.jpeg" id="23" name="Picture"/>
+                    <pic:cNvPr descr="images/Eleanor_Roosevelt_and_Human_Rights_Declaration.jpeg" id="21" name="Picture"/>
                     <pic:cNvPicPr>
                       <a:picLocks noChangeArrowheads="1" noChangeAspect="1"/>
                     </pic:cNvPicPr>
                   </pic:nvPicPr>
                   <pic:blipFill>
-                    <a:blip r:embed="rId21"/>
+                    <a:blip r:embed="rId19"/>
                     <a:stretch>
                       <a:fillRect/>
                     </a:stretch>
@@ -582,7 +520,7 @@
       <w:r>
         <w:t xml:space="preserve"> </w:t>
       </w:r>
-      <w:hyperlink r:id="rId24">
+      <w:hyperlink r:id="rId22">
         <w:r>
           <w:rPr>
             <w:rStyle w:val="Hyperlink"/>
@@ -602,8 +540,8 @@
         <w:t xml:space="preserve">All human beings are born free and equal in dignity and rights. All human beings are born free and equal in dignity and rights. All human beings are born free and equal in dignity and rights. All human beings are born free and equal in dignity and rights.</w:t>
       </w:r>
     </w:p>
-    <w:bookmarkEnd w:id="25"/>
-    <w:bookmarkStart w:id="26" w:name="code"/>
+    <w:bookmarkEnd w:id="23"/>
+    <w:bookmarkStart w:id="24" w:name="code"/>
     <w:p>
       <w:pPr>
         <w:pStyle w:val="Heading2"/>
@@ -645,8 +583,8 @@
         <w:t xml:space="preserve">All human beings are born free and equal in dignity and rights. All human beings are born free and equal in dignity and rights. All human beings are born free and equal in dignity and rights. All human beings are born free and equal in dignity and rights.</w:t>
       </w:r>
     </w:p>
-    <w:bookmarkEnd w:id="26"/>
-    <w:bookmarkStart w:id="29" w:name="urls-and-email-addresses"/>
+    <w:bookmarkEnd w:id="24"/>
+    <w:bookmarkStart w:id="27" w:name="urls-and-email-addresses"/>
     <w:p>
       <w:pPr>
         <w:pStyle w:val="Heading2"/>
@@ -659,7 +597,7 @@
       <w:pPr>
         <w:pStyle w:val="FirstParagraph"/>
       </w:pPr>
-      <w:hyperlink r:id="rId27">
+      <w:hyperlink r:id="rId25">
         <w:r>
           <w:rPr>
             <w:rStyle w:val="Hyperlink"/>
@@ -673,7 +611,7 @@
       <w:r>
         <w:t xml:space="preserve"> </w:t>
       </w:r>
-      <w:hyperlink r:id="rId28">
+      <w:hyperlink r:id="rId26">
         <w:r>
           <w:rPr>
             <w:rStyle w:val="Hyperlink"/>
@@ -685,8 +623,8 @@
         <w:t xml:space="preserve">. All human beings are born free and equal in dignity and rights. All human beings are born free and equal in dignity and rights. All human beings are born free and equal in dignity and rights. All human beings are born free and equal in dignity and rights.</w:t>
       </w:r>
     </w:p>
-    <w:bookmarkEnd w:id="29"/>
-    <w:bookmarkStart w:id="30" w:name="tables"/>
+    <w:bookmarkEnd w:id="27"/>
+    <w:bookmarkStart w:id="28" w:name="tables"/>
     <w:p>
       <w:pPr>
         <w:pStyle w:val="Heading2"/>
@@ -847,14 +785,49 @@
         <w:t xml:space="preserve">All human beings are born free and equal in dignity and rights. All human beings are born free and equal in dignity and rights. All human beings are born free and equal in dignity and rights. All human beings are born free and equal in dignity and rights.</w:t>
       </w:r>
     </w:p>
+    <w:bookmarkEnd w:id="28"/>
+    <w:bookmarkStart w:id="30" w:name="footnotes"/>
+    <w:p>
+      <w:pPr>
+        <w:pStyle w:val="Heading2"/>
+      </w:pPr>
+      <w:r>
+        <w:t xml:space="preserve">Footnotes</w:t>
+      </w:r>
+    </w:p>
+    <w:p>
+      <w:pPr>
+        <w:pStyle w:val="FirstParagraph"/>
+      </w:pPr>
+      <w:r>
+        <w:t xml:space="preserve">All human beings are born free and equal in dignity and rights. All human beings are born free and equal in dignity and rights. All human beings are born free and equal in dignity and rights. All human beings are born free and equal in dignity and rights.</w:t>
+      </w:r>
+      <w:r>
+        <w:rPr>
+          <w:rStyle w:val="FootnoteReference"/>
+        </w:rPr>
+        <w:footnoteReference w:id="29"/>
+      </w:r>
+    </w:p>
     <w:bookmarkEnd w:id="30"/>
-    <w:bookmarkStart w:id="32" w:name="footnotes"/>
+    <w:bookmarkStart w:id="31" w:name="quotes"/>
     <w:p>
       <w:pPr>
         <w:pStyle w:val="Heading2"/>
       </w:pPr>
       <w:r>
-        <w:t xml:space="preserve">Footnotes</w:t>
+        <w:t xml:space="preserve">Quotes</w:t>
+      </w:r>
+    </w:p>
+    <w:p>
+      <w:pPr>
+        <w:pStyle w:val="BlockText"/>
+      </w:pPr>
+      <w:r>
+        <w:rPr>
+          <w:lang w:val="de"/>
+        </w:rPr>
+        <w:t xml:space="preserve">Alle Menschen sind frei und gleich an Würde und Rechten geboren.</w:t>
       </w:r>
     </w:p>
     <w:p>
@@ -864,32 +837,35 @@
       <w:r>
         <w:t xml:space="preserve">All human beings are born free and equal in dignity and rights. All human beings are born free and equal in dignity and rights. All human beings are born free and equal in dignity and rights. All human beings are born free and equal in dignity and rights.</w:t>
       </w:r>
+    </w:p>
+    <w:bookmarkEnd w:id="31"/>
+    <w:bookmarkStart w:id="34" w:name="scientific-citations"/>
+    <w:p>
+      <w:pPr>
+        <w:pStyle w:val="Heading2"/>
+      </w:pPr>
+      <w:r>
+        <w:t xml:space="preserve">Scientific citations</w:t>
+      </w:r>
+    </w:p>
+    <w:p>
+      <w:pPr>
+        <w:pStyle w:val="BlockText"/>
+      </w:pPr>
+      <w:r>
+        <w:t xml:space="preserve">All human beings are born free and equal in dignity and rights. They are endowed with reason and conscience and should act towards one another in a spirit of brotherhood.</w:t>
+      </w:r>
+      <w:r>
+        <w:t xml:space="preserve"> </w:t>
+      </w:r>
+      <w:r>
+        <w:t xml:space="preserve">United Nations</w:t>
+      </w:r>
       <w:r>
         <w:rPr>
           <w:rStyle w:val="FootnoteReference"/>
         </w:rPr>
-        <w:footnoteReference w:id="31"/>
-      </w:r>
-    </w:p>
-    <w:bookmarkEnd w:id="32"/>
-    <w:bookmarkStart w:id="33" w:name="quotes"/>
-    <w:p>
-      <w:pPr>
-        <w:pStyle w:val="Heading2"/>
-      </w:pPr>
-      <w:r>
-        <w:t xml:space="preserve">Quotes</w:t>
-      </w:r>
-    </w:p>
-    <w:p>
-      <w:pPr>
-        <w:pStyle w:val="BlockText"/>
-      </w:pPr>
-      <w:r>
-        <w:rPr>
-          <w:lang w:val="de"/>
-        </w:rPr>
-        <w:t xml:space="preserve">Alle Menschen sind frei und gleich an Würde und Rechten geboren.</w:t>
+        <w:footnoteReference w:id="32"/>
       </w:r>
     </w:p>
     <w:p>
@@ -899,54 +875,16 @@
       <w:r>
         <w:t xml:space="preserve">All human beings are born free and equal in dignity and rights. All human beings are born free and equal in dignity and rights. All human beings are born free and equal in dignity and rights. All human beings are born free and equal in dignity and rights.</w:t>
       </w:r>
-    </w:p>
-    <w:bookmarkEnd w:id="33"/>
-    <w:bookmarkStart w:id="36" w:name="scientific-citations"/>
-    <w:p>
-      <w:pPr>
-        <w:pStyle w:val="Heading2"/>
-      </w:pPr>
-      <w:r>
-        <w:t xml:space="preserve">Scientific citations</w:t>
-      </w:r>
-    </w:p>
-    <w:p>
-      <w:pPr>
-        <w:pStyle w:val="BlockText"/>
-      </w:pPr>
-      <w:r>
-        <w:t xml:space="preserve">All human beings are born free and equal in dignity and rights. They are endowed with reason and conscience and should act towards one another in a spirit of brotherhood.</w:t>
-      </w:r>
-      <w:r>
-        <w:t xml:space="preserve"> </w:t>
-      </w:r>
-      <w:r>
-        <w:t xml:space="preserve">United Nations</w:t>
-      </w:r>
       <w:r>
         <w:rPr>
           <w:rStyle w:val="FootnoteReference"/>
         </w:rPr>
-        <w:footnoteReference w:id="34"/>
-      </w:r>
-    </w:p>
-    <w:p>
-      <w:pPr>
-        <w:pStyle w:val="FirstParagraph"/>
-      </w:pPr>
-      <w:r>
-        <w:t xml:space="preserve">All human beings are born free and equal in dignity and rights. All human beings are born free and equal in dignity and rights. All human beings are born free and equal in dignity and rights. All human beings are born free and equal in dignity and rights.</w:t>
-      </w:r>
-      <w:r>
-        <w:rPr>
-          <w:rStyle w:val="FootnoteReference"/>
-        </w:rPr>
-        <w:footnoteReference w:id="35"/>
-      </w:r>
-    </w:p>
-    <w:bookmarkEnd w:id="36"/>
-    <w:bookmarkEnd w:id="37"/>
-    <w:bookmarkStart w:id="41" w:name="bibliography"/>
+        <w:footnoteReference w:id="33"/>
+      </w:r>
+    </w:p>
+    <w:bookmarkEnd w:id="34"/>
+    <w:bookmarkEnd w:id="35"/>
+    <w:bookmarkStart w:id="39" w:name="bibliography"/>
     <w:p>
       <w:pPr>
         <w:pStyle w:val="Heading1"/>
@@ -955,8 +893,8 @@
         <w:t xml:space="preserve">Bibliography</w:t>
       </w:r>
     </w:p>
-    <w:bookmarkStart w:id="40" w:name="refs"/>
-    <w:bookmarkStart w:id="38" w:name="ref-brown2016"/>
+    <w:bookmarkStart w:id="38" w:name="refs"/>
+    <w:bookmarkStart w:id="36" w:name="ref-brown2016"/>
     <w:p>
       <w:pPr>
         <w:pStyle w:val="Bibliography"/>
@@ -1062,8 +1000,8 @@
         <w:t xml:space="preserve">. Cambridge, [New York]: Open Book Publishers ; NYU Global Institute for Advanced Study, 2016.</w:t>
       </w:r>
     </w:p>
-    <w:bookmarkEnd w:id="38"/>
-    <w:bookmarkStart w:id="39" w:name="ref-unitednations1948"/>
+    <w:bookmarkEnd w:id="36"/>
+    <w:bookmarkStart w:id="37" w:name="ref-unitednations1948"/>
     <w:p>
       <w:pPr>
         <w:pStyle w:val="Bibliography"/>
@@ -1085,9 +1023,9 @@
         <w:t xml:space="preserve">. 1948.</w:t>
       </w:r>
     </w:p>
+    <w:bookmarkEnd w:id="37"/>
+    <w:bookmarkEnd w:id="38"/>
     <w:bookmarkEnd w:id="39"/>
-    <w:bookmarkEnd w:id="40"/>
-    <w:bookmarkEnd w:id="41"/>
     <w:sectPr>
       <w:footnotePr>
         <w:numRestart w:val="eachSect"/>
@@ -1117,7 +1055,7 @@
       </w:r>
     </w:p>
   </w:footnote>
-  <w:footnote w:id="31">
+  <w:footnote w:id="29">
     <w:p>
       <w:pPr>
         <w:pStyle w:val="FootnoteText"/>
@@ -1136,7 +1074,7 @@
       </w:r>
     </w:p>
   </w:footnote>
-  <w:footnote w:id="34">
+  <w:footnote w:id="32">
     <w:p>
       <w:pPr>
         <w:pStyle w:val="FootnoteText"/>
@@ -1165,7 +1103,7 @@
       </w:r>
     </w:p>
   </w:footnote>
-  <w:footnote w:id="35">
+  <w:footnote w:id="33">
     <w:p>
       <w:pPr>
         <w:pStyle w:val="FootnoteText"/>

</xml_diff>